<commit_message>
update chuong1 quy trinh quan ly
</commit_message>
<xml_diff>
--- a/do-an/Chuong_1/1.1. 25210152_Quy trình quản lý.docx
+++ b/do-an/Chuong_1/1.1. 25210152_Quy trình quản lý.docx
@@ -905,109 +905,52 @@
           <w:b/>
           <w:bCs/>
         </w:rPr>
-        <w:t>2.x.1.1. Tổng quan quy trình</w:t>
-      </w:r>
-    </w:p>
-    <w:p>
-      <w:r>
-        <w:t>Quy trình hoạch định chiến lược và lập kế hoạch kinh doanh định hướng hoạt động của toàn hệ thống FAHASA trong từng giai đoạn.</w:t>
+        <w:t xml:space="preserve">2.x.1.1. </w:t>
+      </w:r>
+      <w:r>
+        <w:rPr>
+          <w:b/>
+          <w:bCs/>
+        </w:rPr>
+        <w:t>Mục đích quy trình</w:t>
       </w:r>
     </w:p>
     <w:p>
       <w:pPr>
         <w:keepLines/>
-        <w:spacing w:line="360" w:lineRule="auto"/>
-        <w:rPr>
-          <w:bCs/>
-          <w:szCs w:val="26"/>
-        </w:rPr>
-      </w:pPr>
-      <w:r>
-        <w:rPr>
-          <w:b/>
-          <w:szCs w:val="26"/>
-        </w:rPr>
-        <w:t>Mục đích:</w:t>
-      </w:r>
-      <w:r>
-        <w:rPr>
-          <w:bCs/>
-          <w:szCs w:val="26"/>
-        </w:rPr>
-        <w:t xml:space="preserve"> Xác định mục tiêu phát triển, ưu tiên thị trường, định hướng kênh bán và các chương trình hành động để toàn hệ thống FAHASA vận hành theo một định hướng thống nhất.</w:t>
+        <w:spacing w:after="0" w:line="360" w:lineRule="auto"/>
+        <w:ind w:firstLine="360"/>
+      </w:pPr>
+      <w:r>
+        <w:t>Quy trình hoạch định chiến lược và lập kế hoạch kinh doanh là một trong những quy trình quản lý quan trọng của FAHASA, giúp doanh nghiệp xác định định hướng phát triển và tổ chức các hoạt động kinh doanh theo mục tiêu thống nhất.</w:t>
       </w:r>
     </w:p>
     <w:p>
       <w:pPr>
         <w:keepLines/>
-        <w:spacing w:line="360" w:lineRule="auto"/>
-        <w:rPr>
-          <w:bCs/>
-          <w:szCs w:val="26"/>
-        </w:rPr>
-      </w:pPr>
-      <w:r>
-        <w:rPr>
-          <w:b/>
-          <w:szCs w:val="26"/>
-        </w:rPr>
+        <w:spacing w:after="0" w:line="360" w:lineRule="auto"/>
+        <w:ind w:firstLine="360"/>
+      </w:pPr>
+      <w:r>
         <w:lastRenderedPageBreak/>
-        <w:t>Phạm vi:</w:t>
-      </w:r>
-      <w:r>
-        <w:rPr>
-          <w:bCs/>
-          <w:szCs w:val="26"/>
-        </w:rPr>
-        <w:t xml:space="preserve"> Từ khi bắt đầu chu kỳ hoạch định hoặc xuất hiện biến động chiến lược đến khi kế hoạch được phê duyệt, giao chỉ tiêu và cập nhật cho các đơn vị thực hiện.</w:t>
+        <w:t>Thông qua quy trình này, FAHASA tiến hành phân tích tình hình thị trường, nhu cầu khách hàng, đối thủ cạnh tranh, công nghệ và kết quả hoạt động của kỳ trước để xác định các vấn đề chiến lược, cơ hội tăng trưởng và rủi ro cần ưu tiên. Trên cơ sở đó, Ban điều hành đề xuất mục tiêu, chỉ tiêu và các chương trình hành động phù hợp cho chu kỳ kế hoạch mới.</w:t>
       </w:r>
     </w:p>
     <w:p>
       <w:pPr>
         <w:keepLines/>
-        <w:spacing w:line="360" w:lineRule="auto"/>
-        <w:rPr>
-          <w:bCs/>
-          <w:szCs w:val="26"/>
-        </w:rPr>
-      </w:pPr>
-      <w:r>
-        <w:rPr>
-          <w:b/>
-          <w:szCs w:val="26"/>
-        </w:rPr>
-        <w:t>Điểm bắt đầu:</w:t>
-      </w:r>
-      <w:r>
-        <w:rPr>
-          <w:bCs/>
-          <w:szCs w:val="26"/>
-        </w:rPr>
-        <w:t xml:space="preserve"> Bắt đầu chu kỳ hoạch định năm hoặc xuất hiện thay đổi lớn về thị trường, khách hàng hay công nghệ.</w:t>
-      </w:r>
-    </w:p>
-    <w:p>
-      <w:pPr>
-        <w:keepLines/>
-        <w:spacing w:after="0" w:line="360" w:lineRule="auto"/>
-        <w:rPr>
-          <w:bCs/>
-          <w:szCs w:val="26"/>
-        </w:rPr>
-      </w:pPr>
-      <w:r>
-        <w:rPr>
-          <w:b/>
-          <w:szCs w:val="26"/>
-        </w:rPr>
-        <w:t>Điểm kết thúc:</w:t>
-      </w:r>
-      <w:r>
-        <w:rPr>
-          <w:bCs/>
-          <w:szCs w:val="26"/>
-        </w:rPr>
-        <w:t xml:space="preserve"> Kế hoạch kinh doanh và bộ chỉ tiêu được phê duyệt, truyền đạt và giao trách nhiệm thực hiện.</w:t>
+        <w:spacing w:after="0" w:line="360" w:lineRule="auto"/>
+        <w:ind w:firstLine="360"/>
+      </w:pPr>
+      <w:r>
+        <w:t>Quy trình đồng thời giúp các đơn vị xác định kế hoạch hành động, nhu cầu nguồn lực và trách nhiệm thực hiện, đồng thời tạo cơ sở để Hội đồng quản trị xem xét, điều chỉnh và phê duyệt kế hoạch kinh doanh. Sau khi được phê duyệt, kế hoạch và các chỉ tiêu được truyền đạt đến các đơn vị để triển khai và theo dõi định kỳ</w:t>
+      </w:r>
+      <w:r>
+        <w:rPr>
+          <w:bCs/>
+          <w:szCs w:val="26"/>
+        </w:rPr>
+        <w:t>.</w:t>
       </w:r>
     </w:p>
     <w:p>
@@ -1050,14 +993,6 @@
           <w:szCs w:val="26"/>
         </w:rPr>
         <w:t>Tác nhân tham gia</w:t>
-      </w:r>
-      <w:r>
-        <w:rPr>
-          <w:b/>
-          <w:bCs/>
-          <w:szCs w:val="26"/>
-        </w:rPr>
-        <w:t>:</w:t>
       </w:r>
     </w:p>
     <w:p>
@@ -1309,759 +1244,71 @@
           <w:bCs/>
           <w:szCs w:val="26"/>
         </w:rPr>
-        <w:t>Mô tả quy trình:</w:t>
+        <w:t>Mô tả quy trình</w:t>
       </w:r>
     </w:p>
     <w:p>
       <w:pPr>
         <w:pStyle w:val="ListNumber"/>
         <w:keepLines/>
-        <w:spacing w:line="360" w:lineRule="auto"/>
-        <w:rPr>
-          <w:bCs/>
-          <w:szCs w:val="26"/>
-        </w:rPr>
-      </w:pPr>
-      <w:r>
-        <w:rPr>
-          <w:bCs/>
-          <w:szCs w:val="26"/>
-        </w:rPr>
-        <w:t>Bộ phận kế hoạch thu thập dữ liệu thị trường, nhu cầu khách hàng, đối thủ, công nghệ và kết quả vận hành hiện tại.</w:t>
-      </w:r>
-    </w:p>
-    <w:p>
-      <w:pPr>
-        <w:pStyle w:val="ListNumber"/>
-        <w:keepLines/>
-        <w:spacing w:line="360" w:lineRule="auto"/>
-        <w:rPr>
-          <w:bCs/>
-          <w:szCs w:val="26"/>
-        </w:rPr>
-      </w:pPr>
-      <w:r>
-        <w:rPr>
-          <w:bCs/>
-          <w:szCs w:val="26"/>
-        </w:rPr>
-        <w:t>Ban điều hành cùng các trưởng đơn vị đánh giá mức độ hoàn thành chiến lược và kế hoạch của kỳ trước.</w:t>
-      </w:r>
-    </w:p>
-    <w:p>
-      <w:pPr>
-        <w:pStyle w:val="ListNumber"/>
-        <w:keepLines/>
-        <w:spacing w:line="360" w:lineRule="auto"/>
-        <w:rPr>
-          <w:bCs/>
-          <w:szCs w:val="26"/>
-        </w:rPr>
-      </w:pPr>
-      <w:r>
-        <w:rPr>
-          <w:bCs/>
-          <w:szCs w:val="26"/>
-        </w:rPr>
-        <w:t>Bộ phận kế hoạch xác định các vấn đề chiến lược, cơ hội tăng trưởng và rủi ro cần ưu tiên.</w:t>
-      </w:r>
-    </w:p>
-    <w:p>
-      <w:pPr>
-        <w:pStyle w:val="ListNumber"/>
-        <w:keepLines/>
-        <w:spacing w:line="360" w:lineRule="auto"/>
-        <w:rPr>
-          <w:bCs/>
-          <w:szCs w:val="26"/>
-        </w:rPr>
-      </w:pPr>
-      <w:r>
-        <w:rPr>
-          <w:bCs/>
-          <w:szCs w:val="26"/>
-        </w:rPr>
-        <w:lastRenderedPageBreak/>
-        <w:t>Ban điều hành đề xuất mục tiêu, chỉ tiêu kết quả và các sáng kiến cho chu kỳ kế hoạch mới.</w:t>
-      </w:r>
-    </w:p>
-    <w:p>
-      <w:pPr>
-        <w:pStyle w:val="ListNumber"/>
-        <w:keepLines/>
-        <w:spacing w:line="360" w:lineRule="auto"/>
-        <w:rPr>
-          <w:bCs/>
-          <w:szCs w:val="26"/>
-        </w:rPr>
-      </w:pPr>
-      <w:r>
-        <w:rPr>
-          <w:bCs/>
-          <w:szCs w:val="26"/>
-        </w:rPr>
-        <w:t>Các khối kinh doanh và chức năng xây dựng kế hoạch hành động, nhu cầu nguồn lực và mốc thực hiện của đơn vị mình.</w:t>
-      </w:r>
-    </w:p>
-    <w:p>
-      <w:pPr>
-        <w:pStyle w:val="ListNumber"/>
-        <w:keepLines/>
-        <w:spacing w:line="360" w:lineRule="auto"/>
-        <w:rPr>
-          <w:bCs/>
-          <w:szCs w:val="26"/>
-        </w:rPr>
-      </w:pPr>
-      <w:r>
-        <w:rPr>
-          <w:bCs/>
-          <w:szCs w:val="26"/>
-        </w:rPr>
-        <w:t>Bộ phận tài chính đánh giá tính khả thi của các phương án theo ngân sách, dòng tiền và năng lực nguồn lực.</w:t>
-      </w:r>
-    </w:p>
-    <w:p>
-      <w:pPr>
-        <w:pStyle w:val="ListNumber"/>
-        <w:keepLines/>
-        <w:spacing w:line="360" w:lineRule="auto"/>
-        <w:rPr>
-          <w:bCs/>
-          <w:szCs w:val="26"/>
-        </w:rPr>
-      </w:pPr>
-      <w:r>
-        <w:rPr>
-          <w:bCs/>
-          <w:szCs w:val="26"/>
-        </w:rPr>
-        <w:t>Ban điều hành tổng hợp, xử lý xung đột ưu tiên và trình phương án kế hoạch lên Hội đồng quản trị.</w:t>
-      </w:r>
-    </w:p>
-    <w:p>
-      <w:pPr>
-        <w:pStyle w:val="ListNumber"/>
-        <w:keepLines/>
-        <w:spacing w:line="360" w:lineRule="auto"/>
-        <w:rPr>
-          <w:bCs/>
-          <w:szCs w:val="26"/>
-        </w:rPr>
-      </w:pPr>
-      <w:r>
-        <w:rPr>
-          <w:bCs/>
-          <w:szCs w:val="26"/>
-        </w:rPr>
-        <w:t>Hội đồng quản trị xem xét, yêu cầu điều chỉnh nếu cần và phê duyệt kế hoạch kinh doanh.</w:t>
-      </w:r>
-    </w:p>
-    <w:p>
-      <w:pPr>
-        <w:pStyle w:val="ListNumber"/>
-        <w:keepLines/>
-        <w:spacing w:line="360" w:lineRule="auto"/>
-        <w:rPr>
-          <w:bCs/>
-          <w:szCs w:val="26"/>
-        </w:rPr>
-      </w:pPr>
-      <w:r>
-        <w:rPr>
-          <w:bCs/>
-          <w:szCs w:val="26"/>
-        </w:rPr>
-        <w:t>Ban điều hành truyền đạt kế hoạch, giao chỉ tiêu cho các đơn vị và thiết lập lịch rà soát định kỳ.</w:t>
-      </w:r>
-    </w:p>
-    <w:p>
-      <w:pPr>
-        <w:spacing w:after="0" w:line="360" w:lineRule="auto"/>
-        <w:rPr>
-          <w:b/>
-          <w:bCs/>
-          <w:szCs w:val="26"/>
-        </w:rPr>
-      </w:pPr>
-      <w:r>
-        <w:rPr>
-          <w:b/>
-          <w:bCs/>
-          <w:szCs w:val="26"/>
-        </w:rPr>
-        <w:t>2.x.1.</w:t>
-      </w:r>
-      <w:r>
-        <w:rPr>
-          <w:b/>
-          <w:bCs/>
-          <w:szCs w:val="26"/>
-        </w:rPr>
-        <w:t>4</w:t>
-      </w:r>
-      <w:r>
-        <w:rPr>
-          <w:b/>
-          <w:bCs/>
-          <w:szCs w:val="26"/>
-        </w:rPr>
-        <w:t xml:space="preserve">. </w:t>
-      </w:r>
-      <w:r>
-        <w:rPr>
-          <w:b/>
-          <w:bCs/>
-          <w:szCs w:val="26"/>
-        </w:rPr>
-        <w:t>Khách hàng của quy trình</w:t>
-      </w:r>
-      <w:r>
-        <w:rPr>
-          <w:b/>
-          <w:bCs/>
-          <w:szCs w:val="26"/>
-        </w:rPr>
-        <w:t>:</w:t>
-      </w:r>
-    </w:p>
-    <w:p>
-      <w:pPr>
-        <w:pStyle w:val="ListBullet"/>
-        <w:spacing w:line="360" w:lineRule="auto"/>
-        <w:rPr>
-          <w:bCs/>
-          <w:szCs w:val="26"/>
-        </w:rPr>
-      </w:pPr>
-      <w:r>
-        <w:rPr>
-          <w:bCs/>
-          <w:szCs w:val="26"/>
-        </w:rPr>
-        <w:t>Hội đồng quản trị và Ban điều hành</w:t>
-      </w:r>
-      <w:r>
-        <w:rPr>
-          <w:bCs/>
-          <w:szCs w:val="26"/>
-        </w:rPr>
-        <w:t xml:space="preserve">: </w:t>
-      </w:r>
-    </w:p>
-    <w:p>
-      <w:pPr>
-        <w:pStyle w:val="ListBullet"/>
         <w:numPr>
           <w:ilvl w:val="0"/>
           <w:numId w:val="0"/>
         </w:numPr>
         <w:spacing w:line="360" w:lineRule="auto"/>
-        <w:ind w:left="539"/>
-        <w:rPr>
-          <w:bCs/>
-          <w:szCs w:val="26"/>
-        </w:rPr>
-      </w:pPr>
-      <w:r>
-        <w:rPr>
-          <w:bCs/>
-          <w:szCs w:val="26"/>
-        </w:rPr>
-        <w:t>Xem xét kế hoạch kinh doanh; phản hồi và yêu cầu điều chỉnh; phê duyệt mục tiêu, chỉ tiêu, chương trình hành động và nguồn lực; ban hành định hướng triển khai.</w:t>
-      </w:r>
-    </w:p>
-    <w:p>
-      <w:pPr>
-        <w:pStyle w:val="ListBullet"/>
-        <w:spacing w:line="360" w:lineRule="auto"/>
-        <w:rPr>
-          <w:bCs/>
-          <w:szCs w:val="26"/>
-        </w:rPr>
-      </w:pPr>
-      <w:r>
-        <w:rPr>
-          <w:bCs/>
-          <w:szCs w:val="26"/>
-        </w:rPr>
-        <w:t>Các khối, phòng ban, trung tâm và cửa hàng nhận chỉ tiêu</w:t>
-      </w:r>
-      <w:r>
-        <w:rPr>
-          <w:bCs/>
-          <w:szCs w:val="26"/>
-        </w:rPr>
-        <w:t xml:space="preserve">: </w:t>
-      </w:r>
-    </w:p>
-    <w:p>
-      <w:pPr>
-        <w:pStyle w:val="ListBullet"/>
+        <w:ind w:left="360"/>
+        <w:rPr>
+          <w:szCs w:val="26"/>
+        </w:rPr>
+      </w:pPr>
+      <w:r>
+        <w:rPr>
+          <w:szCs w:val="26"/>
+        </w:rPr>
+        <w:t>Bước 1: Bộ phận kế hoạch thu thập dữ liệu thị trường, nhu cầu khách hàng, đối thủ, công nghệ và kết quả vận hành hiện tại.</w:t>
+      </w:r>
+    </w:p>
+    <w:p>
+      <w:pPr>
+        <w:pStyle w:val="ListNumber"/>
+        <w:keepLines/>
         <w:numPr>
           <w:ilvl w:val="0"/>
           <w:numId w:val="0"/>
         </w:numPr>
         <w:spacing w:line="360" w:lineRule="auto"/>
-        <w:ind w:left="539"/>
-        <w:rPr>
-          <w:bCs/>
-          <w:szCs w:val="26"/>
-        </w:rPr>
-      </w:pPr>
-      <w:r>
-        <w:rPr>
-          <w:bCs/>
-          <w:szCs w:val="26"/>
-        </w:rPr>
-        <w:t>Tiếp nhận chỉ tiêu; chuyển chỉ tiêu thành kế hoạch hành động của đơn vị; phân công người thực hiện; bố trí nguồn lực; báo cáo tiến độ và đề xuất điều chỉnh khi cần.</w:t>
-      </w:r>
-    </w:p>
-    <w:p>
-      <w:pPr>
-        <w:pStyle w:val="ListBullet"/>
-        <w:spacing w:line="360" w:lineRule="auto"/>
-        <w:rPr>
-          <w:bCs/>
-          <w:szCs w:val="26"/>
-        </w:rPr>
-      </w:pPr>
-      <w:r>
-        <w:rPr>
-          <w:bCs/>
-          <w:szCs w:val="26"/>
-        </w:rPr>
-        <w:t>Cổ đông/chủ sở hữu nhận định hướng và kết quả kỳ vọng</w:t>
-      </w:r>
-      <w:r>
-        <w:rPr>
-          <w:bCs/>
-          <w:szCs w:val="26"/>
-        </w:rPr>
-        <w:t xml:space="preserve">: </w:t>
-      </w:r>
-    </w:p>
-    <w:p>
-      <w:pPr>
-        <w:pStyle w:val="ListBullet"/>
+        <w:ind w:left="360"/>
+        <w:rPr>
+          <w:szCs w:val="26"/>
+        </w:rPr>
+      </w:pPr>
+      <w:r>
+        <w:rPr>
+          <w:szCs w:val="26"/>
+        </w:rPr>
+        <w:t>Bước 2: Ban điều hành cùng các trưởng đơn vị đánh giá mức độ hoàn thành chiến lược và kế hoạch của kỳ trước.</w:t>
+      </w:r>
+    </w:p>
+    <w:p>
+      <w:pPr>
+        <w:pStyle w:val="ListNumber"/>
+        <w:keepLines/>
         <w:numPr>
           <w:ilvl w:val="0"/>
           <w:numId w:val="0"/>
         </w:numPr>
-        <w:spacing w:after="0" w:line="360" w:lineRule="auto"/>
-        <w:ind w:left="533"/>
-        <w:rPr>
-          <w:bCs/>
-          <w:szCs w:val="26"/>
-        </w:rPr>
-      </w:pPr>
-      <w:r>
-        <w:rPr>
-          <w:bCs/>
-          <w:szCs w:val="26"/>
-        </w:rPr>
-        <w:t>Tiếp nhận định hướng và kết quả kỳ vọng; theo dõi mức độ hoàn thành mục tiêu; đưa ra yêu cầu quản trị hoặc ý kiến điều chỉnh thông qua Hội đồng quản trị.</w:t>
-      </w:r>
-    </w:p>
-    <w:p>
-      <w:pPr>
-        <w:spacing w:after="0" w:line="360" w:lineRule="auto"/>
-        <w:rPr>
-          <w:b/>
-          <w:bCs/>
-          <w:szCs w:val="26"/>
-        </w:rPr>
-      </w:pPr>
-      <w:r>
-        <w:rPr>
-          <w:b/>
-          <w:bCs/>
-          <w:szCs w:val="26"/>
-        </w:rPr>
-        <w:t>2.x.1.</w:t>
-      </w:r>
-      <w:r>
-        <w:rPr>
-          <w:b/>
-          <w:bCs/>
-          <w:szCs w:val="26"/>
-        </w:rPr>
-        <w:t>5</w:t>
-      </w:r>
-      <w:r>
-        <w:rPr>
-          <w:b/>
-          <w:bCs/>
-          <w:szCs w:val="26"/>
-        </w:rPr>
-        <w:t>. Kết quả của quy trình</w:t>
-      </w:r>
-    </w:p>
-    <w:p>
-      <w:pPr>
-        <w:spacing w:after="0" w:line="360" w:lineRule="auto"/>
-        <w:rPr>
-          <w:bCs/>
-          <w:szCs w:val="26"/>
-        </w:rPr>
-      </w:pPr>
-      <w:r>
-        <w:rPr>
-          <w:b/>
-          <w:color w:val="000000" w:themeColor="text1"/>
-          <w:szCs w:val="26"/>
-        </w:rPr>
-        <w:t xml:space="preserve">Kết quả thành công: </w:t>
-      </w:r>
-      <w:r>
-        <w:rPr>
-          <w:bCs/>
-          <w:szCs w:val="26"/>
-        </w:rPr>
-        <w:t>Một kế hoạch kinh doanh khả thi, có mục tiêu, chỉ tiêu, chương trình hành động, nguồn lực và chủ sở hữu rõ ràng được phê duyệt và triển khai.</w:t>
-      </w:r>
-    </w:p>
-    <w:p>
-      <w:pPr>
-        <w:spacing w:after="0" w:line="360" w:lineRule="auto"/>
-        <w:rPr>
-          <w:b/>
-          <w:szCs w:val="26"/>
-        </w:rPr>
-      </w:pPr>
-      <w:r>
-        <w:rPr>
-          <w:b/>
-          <w:szCs w:val="26"/>
-        </w:rPr>
-        <w:t>Các khả năng kết quả khác</w:t>
-      </w:r>
-      <w:r>
-        <w:rPr>
-          <w:b/>
-          <w:szCs w:val="26"/>
-        </w:rPr>
-        <w:t>:</w:t>
-      </w:r>
-    </w:p>
-    <w:p>
-      <w:pPr>
-        <w:pStyle w:val="ListBullet"/>
-        <w:spacing w:line="360" w:lineRule="auto"/>
-        <w:rPr>
-          <w:bCs/>
-          <w:szCs w:val="26"/>
-        </w:rPr>
-      </w:pPr>
-      <w:r>
-        <w:rPr>
-          <w:bCs/>
-          <w:szCs w:val="26"/>
-        </w:rPr>
-        <w:t>Kế hoạch bị trả lại để điều chỉnh vì mục tiêu hoặc nguồn lực chưa khả thi.</w:t>
-      </w:r>
-    </w:p>
-    <w:p>
-      <w:pPr>
-        <w:pStyle w:val="ListBullet"/>
-        <w:spacing w:line="360" w:lineRule="auto"/>
-        <w:rPr>
-          <w:bCs/>
-          <w:szCs w:val="26"/>
-        </w:rPr>
-      </w:pPr>
-      <w:r>
-        <w:rPr>
-          <w:bCs/>
-          <w:szCs w:val="26"/>
-        </w:rPr>
-        <w:t>Chu kỳ phê duyệt bị chậm do dữ liệu đầu vào thiếu hoặc các đơn vị chưa thống nhất ưu tiên.</w:t>
-      </w:r>
-    </w:p>
-    <w:p>
-      <w:pPr>
-        <w:pStyle w:val="ListBullet"/>
-        <w:spacing w:line="360" w:lineRule="auto"/>
-        <w:rPr>
-          <w:bCs/>
-          <w:szCs w:val="26"/>
-        </w:rPr>
-      </w:pPr>
-      <w:r>
-        <w:rPr>
-          <w:bCs/>
+        <w:spacing w:line="360" w:lineRule="auto"/>
+        <w:ind w:left="360"/>
+        <w:rPr>
+          <w:szCs w:val="26"/>
+        </w:rPr>
+      </w:pPr>
+      <w:r>
+        <w:rPr>
           <w:szCs w:val="26"/>
         </w:rPr>
         <w:lastRenderedPageBreak/>
-        <w:t>Kế hoạch đã phê duyệt được cập nhật giữa kỳ khi thị trường, pháp lý hoặc năng lực vận hành thay đổi đáng kể.</w:t>
-      </w:r>
-    </w:p>
-    <w:p>
-      <w:pPr>
-        <w:spacing w:after="0" w:line="360" w:lineRule="auto"/>
-        <w:rPr>
-          <w:b/>
-          <w:bCs/>
-        </w:rPr>
-      </w:pPr>
-      <w:r>
-        <w:rPr>
-          <w:b/>
-          <w:bCs/>
-        </w:rPr>
-        <w:t>2.</w:t>
-      </w:r>
-      <w:r>
-        <w:rPr>
-          <w:b/>
-          <w:bCs/>
-        </w:rPr>
-        <w:t>x</w:t>
-      </w:r>
-      <w:r>
-        <w:rPr>
-          <w:b/>
-          <w:bCs/>
-        </w:rPr>
-        <w:t xml:space="preserve">.2. </w:t>
-      </w:r>
-      <w:r>
-        <w:rPr>
-          <w:b/>
-          <w:bCs/>
-        </w:rPr>
-        <w:t>MGT-02 Lập ngân sách, giám sát doanh thu và quản trị hiệu suất</w:t>
-      </w:r>
-    </w:p>
-    <w:p>
-      <w:pPr>
-        <w:rPr>
-          <w:b/>
-          <w:bCs/>
-        </w:rPr>
-      </w:pPr>
-      <w:r>
-        <w:rPr>
-          <w:b/>
-          <w:bCs/>
-        </w:rPr>
-        <w:t>2.x.</w:t>
-      </w:r>
-      <w:r>
-        <w:rPr>
-          <w:b/>
-          <w:bCs/>
-        </w:rPr>
-        <w:t>2</w:t>
-      </w:r>
-      <w:r>
-        <w:rPr>
-          <w:b/>
-          <w:bCs/>
-        </w:rPr>
-        <w:t>.1. Tổng quan quy trình</w:t>
-      </w:r>
-    </w:p>
-    <w:p>
-      <w:r>
-        <w:t>Quy trình lập ngân sách, giám sát doanh thu và quản trị hiệu suất giúp FAHASA phân bổ nguồn lực, theo dõi kết quả thực hiện và kịp thời điều chỉnh hoạt động kinh doanh.</w:t>
-      </w:r>
-    </w:p>
-    <w:p>
-      <w:pPr>
-        <w:spacing w:line="360" w:lineRule="auto"/>
-      </w:pPr>
-      <w:r>
-        <w:rPr>
-          <w:b/>
-        </w:rPr>
-        <w:t xml:space="preserve">Mục đích: </w:t>
-      </w:r>
-      <w:r>
-        <w:t>Chuyển kế hoạch kinh doanh thành ngân sách và chỉ tiêu đo lường; theo dõi chênh lệch thực tế để Ban điều hành có hành động điều chỉnh kịp thời.</w:t>
-      </w:r>
-    </w:p>
-    <w:p>
-      <w:pPr>
-        <w:spacing w:line="360" w:lineRule="auto"/>
-      </w:pPr>
-      <w:r>
-        <w:rPr>
-          <w:b/>
-        </w:rPr>
-        <w:t xml:space="preserve">Phạm vi: </w:t>
-      </w:r>
-      <w:r>
-        <w:t>Từ khi tiếp nhận kế hoạch và chỉ tiêu đã duyệt đến khi chốt báo cáo hiệu suất kỳ, xử lý chênh lệch và cập nhật dự báo.</w:t>
-      </w:r>
-    </w:p>
-    <w:p>
-      <w:pPr>
-        <w:keepLines/>
-        <w:spacing w:line="360" w:lineRule="auto"/>
-      </w:pPr>
-      <w:r>
-        <w:rPr>
-          <w:b/>
-        </w:rPr>
-        <w:t xml:space="preserve">Điểm bắt đầu: </w:t>
-      </w:r>
-      <w:r>
-        <w:t>Kế hoạch kinh doanh được phê duyệt hoặc bắt đầu chu kỳ lập/nghiệm thu ngân sách.</w:t>
-      </w:r>
-    </w:p>
-    <w:p>
-      <w:pPr>
-        <w:keepLines/>
-        <w:spacing w:line="360" w:lineRule="auto"/>
-      </w:pPr>
-      <w:r>
-        <w:rPr>
-          <w:b/>
-        </w:rPr>
-        <w:t xml:space="preserve">Điểm kết thúc: </w:t>
-      </w:r>
-      <w:r>
-        <w:t>Báo cáo hiệu suất và dự báo cập nhật được phê duyệt; hành động khắc phục được giao cho đơn vị chịu trách nhiệm.</w:t>
-      </w:r>
-    </w:p>
-    <w:p>
-      <w:pPr>
-        <w:spacing w:after="0" w:line="360" w:lineRule="auto"/>
-        <w:rPr>
-          <w:b/>
-          <w:bCs/>
-          <w:szCs w:val="26"/>
-        </w:rPr>
-      </w:pPr>
-      <w:r>
-        <w:rPr>
-          <w:b/>
-          <w:bCs/>
-          <w:szCs w:val="26"/>
-        </w:rPr>
-        <w:t>2.x.2.</w:t>
-      </w:r>
-      <w:r>
-        <w:rPr>
-          <w:b/>
-          <w:bCs/>
-          <w:szCs w:val="26"/>
-        </w:rPr>
-        <w:t>2</w:t>
-      </w:r>
-      <w:r>
-        <w:rPr>
-          <w:b/>
-          <w:bCs/>
-          <w:szCs w:val="26"/>
-        </w:rPr>
-        <w:t xml:space="preserve">. </w:t>
-      </w:r>
-      <w:r>
-        <w:rPr>
-          <w:b/>
-          <w:bCs/>
-          <w:szCs w:val="26"/>
-        </w:rPr>
-        <w:t>Tác nhân tham gia</w:t>
-      </w:r>
-      <w:r>
-        <w:rPr>
-          <w:b/>
-          <w:bCs/>
-          <w:szCs w:val="26"/>
-        </w:rPr>
-        <w:t>:</w:t>
-      </w:r>
-    </w:p>
-    <w:p>
-      <w:pPr>
-        <w:pStyle w:val="ListBullet"/>
-        <w:spacing w:line="360" w:lineRule="auto"/>
-      </w:pPr>
-      <w:r>
-        <w:t>Ban điều hành</w:t>
-      </w:r>
-      <w:r>
-        <w:t>: Xem xét phương án ngân sách, quyết định mức phân bổ, phê duyệt dự báo cập nhật và giao hành động xử lý các chênh lệch trọng yếu.</w:t>
-      </w:r>
-    </w:p>
-    <w:p>
-      <w:pPr>
-        <w:pStyle w:val="ListBullet"/>
-        <w:spacing w:line="360" w:lineRule="auto"/>
-      </w:pPr>
-      <w:r>
-        <w:t>Bộ phận tài chính - kế toán</w:t>
-      </w:r>
-      <w:r>
-        <w:t>: Ban hành hướng dẫn dự toán, hợp nhất ngân sách, đối chiếu số thực tế, lập báo cáo hiệu suất và theo dõi hành động khắc phục.</w:t>
-      </w:r>
-    </w:p>
-    <w:p>
-      <w:pPr>
-        <w:pStyle w:val="ListBullet"/>
-        <w:spacing w:line="360" w:lineRule="auto"/>
-      </w:pPr>
-      <w:r>
-        <w:t>Trưởng các khối/phòng ban</w:t>
-      </w:r>
-      <w:r>
-        <w:t>: Lập dự toán của đơn vị, kiểm soát việc sử dụng ngân sách, giải trình chênh lệch và triển khai hành động cải thiện đã được giao.</w:t>
-      </w:r>
-    </w:p>
-    <w:p>
-      <w:pPr>
-        <w:pStyle w:val="ListBullet"/>
-        <w:spacing w:line="360" w:lineRule="auto"/>
-      </w:pPr>
-      <w:r>
-        <w:t>Quản lý cửa hàng và kênh trực tuyến</w:t>
-      </w:r>
-      <w:r>
-        <w:t>: Cung cấp dữ liệu doanh thu, chi phí và dự báo tại điểm vận hành; xác minh sai lệch và thực hiện biện pháp điều chỉnh tại đơn vị.</w:t>
-      </w:r>
-    </w:p>
-    <w:p>
-      <w:pPr>
-        <w:pStyle w:val="ListBullet"/>
-        <w:spacing w:line="360" w:lineRule="auto"/>
-      </w:pPr>
-      <w:r>
-        <w:t>Hệ thống POS/ERP/BI</w:t>
-      </w:r>
-      <w:r>
-        <w:t>: Ghi nhận và tổng hợp dữ liệu doanh thu, chi phí, ngân sách và chỉ số vận hành để cung cấp báo cáo nhất quán cho các cấp quản lý.</w:t>
-      </w:r>
-    </w:p>
-    <w:p>
-      <w:pPr>
-        <w:spacing w:after="0" w:line="360" w:lineRule="auto"/>
-      </w:pPr>
-      <w:r>
-        <w:rPr>
-          <w:b/>
-          <w:bCs/>
-          <w:szCs w:val="26"/>
-        </w:rPr>
-        <w:t>2.x.2.</w:t>
-      </w:r>
-      <w:r>
-        <w:rPr>
-          <w:b/>
-          <w:bCs/>
-          <w:szCs w:val="26"/>
-        </w:rPr>
-        <w:t>3</w:t>
-      </w:r>
-      <w:r>
-        <w:rPr>
-          <w:b/>
-          <w:bCs/>
-          <w:szCs w:val="26"/>
-        </w:rPr>
-        <w:t>. Mô tả quy trình:</w:t>
+        <w:t>Bước 3: Bộ phận kế hoạch xác định các vấn đề chiến lược, cơ hội tăng trưởng và rủi ro cần ưu tiên.</w:t>
       </w:r>
     </w:p>
     <w:p>
@@ -2070,559 +1317,236 @@
         <w:keepLines/>
         <w:numPr>
           <w:ilvl w:val="0"/>
-          <w:numId w:val="5"/>
+          <w:numId w:val="0"/>
         </w:numPr>
         <w:spacing w:line="360" w:lineRule="auto"/>
-      </w:pPr>
-      <w:r>
-        <w:t>Bộ phận tài chính tiếp nhận mục tiêu, chỉ tiêu và các sáng kiến đã được phê duyệt trong kế hoạch kinh doanh.</w:t>
+        <w:ind w:left="360"/>
+        <w:rPr>
+          <w:szCs w:val="26"/>
+        </w:rPr>
+      </w:pPr>
+      <w:r>
+        <w:rPr>
+          <w:szCs w:val="26"/>
+        </w:rPr>
+        <w:t>Bước 4: Ban điều hành đề xuất mục tiêu, chỉ tiêu kết quả và các sáng kiến cho chu kỳ kế hoạch mới.</w:t>
       </w:r>
     </w:p>
     <w:p>
       <w:pPr>
         <w:pStyle w:val="ListNumber"/>
         <w:keepLines/>
-        <w:spacing w:line="360" w:lineRule="auto"/>
-      </w:pPr>
-      <w:r>
-        <w:lastRenderedPageBreak/>
-        <w:t>Các đơn vị lập dự toán doanh thu, chi phí, đầu tư và nhu cầu nhân lực theo hướng dẫn chung.</w:t>
-      </w:r>
-    </w:p>
-    <w:p>
-      <w:pPr>
-        <w:pStyle w:val="ListNumber"/>
-        <w:keepLines/>
-        <w:spacing w:line="360" w:lineRule="auto"/>
-      </w:pPr>
-      <w:r>
-        <w:t>Bộ phận tài chính kiểm tra giả định, chuẩn hóa biểu mẫu và hợp nhất dự toán toàn doanh nghiệp.</w:t>
-      </w:r>
-    </w:p>
-    <w:p>
-      <w:pPr>
-        <w:pStyle w:val="ListNumber"/>
-        <w:keepLines/>
-        <w:spacing w:line="360" w:lineRule="auto"/>
-      </w:pPr>
-      <w:r>
-        <w:t>Ban điều hành xem xét các phương án, điều chỉnh mức phân bổ và phê duyệt ngân sách theo đơn vị.</w:t>
-      </w:r>
-    </w:p>
-    <w:p>
-      <w:pPr>
-        <w:pStyle w:val="ListNumber"/>
-        <w:keepLines/>
-        <w:spacing w:line="360" w:lineRule="auto"/>
-      </w:pPr>
-      <w:r>
-        <w:t>Hệ thống POS/ERP/BI ghi nhận doanh thu, chi phí và các chỉ số vận hành phát sinh trong kỳ.</w:t>
-      </w:r>
-    </w:p>
-    <w:p>
-      <w:pPr>
-        <w:pStyle w:val="ListNumber"/>
-        <w:keepLines/>
-        <w:spacing w:line="360" w:lineRule="auto"/>
-      </w:pPr>
-      <w:r>
-        <w:t>Bộ phận tài chính đối chiếu số thực tế với ngân sách, kế hoạch và cùng kỳ để xác định chênh lệch.</w:t>
-      </w:r>
-    </w:p>
-    <w:p>
-      <w:pPr>
-        <w:pStyle w:val="ListNumber"/>
-        <w:keepLines/>
-        <w:spacing w:line="360" w:lineRule="auto"/>
-      </w:pPr>
-      <w:r>
-        <w:t>Trưởng đơn vị giải trình nguyên nhân chênh lệch và đề xuất hành động cải thiện.</w:t>
-      </w:r>
-    </w:p>
-    <w:p>
-      <w:pPr>
-        <w:pStyle w:val="ListNumber"/>
-        <w:keepLines/>
-        <w:spacing w:line="360" w:lineRule="auto"/>
-      </w:pPr>
-      <w:r>
-        <w:t>Ban điều hành ưu tiên hành động, điều chuyển nguồn lực hoặc cập nhật dự báo khi cần.</w:t>
-      </w:r>
-    </w:p>
-    <w:p>
-      <w:pPr>
-        <w:pStyle w:val="ListNumber"/>
-        <w:keepLines/>
-        <w:spacing w:line="360" w:lineRule="auto"/>
-      </w:pPr>
-      <w:r>
-        <w:t>Bộ phận tài chính phát hành báo cáo hiệu suất kỳ và theo dõi việc hoàn thành hành động khắc phục.</w:t>
-      </w:r>
-    </w:p>
-    <w:p>
-      <w:pPr>
-        <w:spacing w:after="0" w:line="360" w:lineRule="auto"/>
-      </w:pPr>
-      <w:r>
-        <w:rPr>
-          <w:b/>
-          <w:bCs/>
-          <w:szCs w:val="26"/>
-        </w:rPr>
-        <w:t>2.x.2.</w:t>
-      </w:r>
-      <w:r>
-        <w:rPr>
-          <w:b/>
-          <w:bCs/>
-          <w:szCs w:val="26"/>
-        </w:rPr>
-        <w:t>4</w:t>
-      </w:r>
-      <w:r>
-        <w:rPr>
-          <w:b/>
-          <w:bCs/>
-          <w:szCs w:val="26"/>
-        </w:rPr>
-        <w:t xml:space="preserve">. </w:t>
-      </w:r>
-      <w:r>
-        <w:rPr>
-          <w:b/>
-          <w:bCs/>
-          <w:szCs w:val="26"/>
-        </w:rPr>
-        <w:t>Khách hàng của quy trình</w:t>
-      </w:r>
-    </w:p>
-    <w:p>
-      <w:pPr>
-        <w:pStyle w:val="ListBullet"/>
-        <w:spacing w:line="360" w:lineRule="auto"/>
-      </w:pPr>
-      <w:r>
-        <w:t>Ban điều hành và Hội đồng quản trị</w:t>
-      </w:r>
-      <w:r>
-        <w:t xml:space="preserve">: </w:t>
-      </w:r>
-    </w:p>
-    <w:p>
-      <w:pPr>
-        <w:pStyle w:val="ListBullet"/>
         <w:numPr>
           <w:ilvl w:val="0"/>
           <w:numId w:val="0"/>
         </w:numPr>
         <w:spacing w:line="360" w:lineRule="auto"/>
-        <w:ind w:left="539"/>
-      </w:pPr>
-      <w:r>
-        <w:t>Xem xét dự toán, báo cáo doanh thu, chi phí và hiệu suất; phê duyệt ngân sách; quyết định điều chuyển nguồn lực; yêu cầu xử lý các chênh lệch trọng yếu.</w:t>
-      </w:r>
-    </w:p>
-    <w:p>
-      <w:pPr>
-        <w:pStyle w:val="ListBullet"/>
-        <w:spacing w:line="360" w:lineRule="auto"/>
-      </w:pPr>
-      <w:r>
-        <w:t>Trưởng các đơn vị quản lý ngân sách</w:t>
-      </w:r>
-      <w:r>
-        <w:t xml:space="preserve">: </w:t>
-      </w:r>
-    </w:p>
-    <w:p>
-      <w:pPr>
-        <w:pStyle w:val="ListBullet"/>
+        <w:ind w:left="360"/>
+        <w:rPr>
+          <w:szCs w:val="26"/>
+        </w:rPr>
+      </w:pPr>
+      <w:r>
+        <w:rPr>
+          <w:szCs w:val="26"/>
+        </w:rPr>
+        <w:t>Bước 5: Các khối kinh doanh và chức năng xây dựng kế hoạch hành động, nhu cầu nguồn lực và mốc thực hiện của đơn vị mình.</w:t>
+      </w:r>
+    </w:p>
+    <w:p>
+      <w:pPr>
+        <w:pStyle w:val="ListNumber"/>
+        <w:keepLines/>
         <w:numPr>
           <w:ilvl w:val="0"/>
           <w:numId w:val="0"/>
         </w:numPr>
         <w:spacing w:line="360" w:lineRule="auto"/>
-        <w:ind w:left="539"/>
-      </w:pPr>
-      <w:r>
-        <w:t>Lập và gửi dự toán; sử dụng ngân sách đúng mục đích; theo dõi chi tiêu; giải trình chênh lệch; thực hiện hành động khắc phục theo quyết định của cấp quản lý.</w:t>
-      </w:r>
-    </w:p>
-    <w:p>
-      <w:pPr>
-        <w:pStyle w:val="ListBullet"/>
-        <w:spacing w:line="360" w:lineRule="auto"/>
-      </w:pPr>
-      <w:r>
-        <w:t>Các đơn vị vận hành cần thông tin hiệu suất để điều chỉnh hoạt động</w:t>
-      </w:r>
-      <w:r>
-        <w:t xml:space="preserve">: </w:t>
-      </w:r>
-    </w:p>
-    <w:p>
-      <w:pPr>
-        <w:pStyle w:val="ListBullet"/>
+        <w:ind w:left="360"/>
+        <w:rPr>
+          <w:szCs w:val="26"/>
+        </w:rPr>
+      </w:pPr>
+      <w:r>
+        <w:rPr>
+          <w:szCs w:val="26"/>
+        </w:rPr>
+        <w:t>Bước 6: Bộ phận tài chính đánh giá tính khả thi của các phương án theo ngân sách, dòng tiền và năng lực nguồn lực.</w:t>
+      </w:r>
+    </w:p>
+    <w:p>
+      <w:pPr>
+        <w:pStyle w:val="ListNumber"/>
+        <w:keepLines/>
         <w:numPr>
           <w:ilvl w:val="0"/>
           <w:numId w:val="0"/>
         </w:numPr>
         <w:spacing w:line="360" w:lineRule="auto"/>
-        <w:ind w:left="539"/>
-      </w:pPr>
-      <w:r>
-        <w:t>Cung cấp số liệu doanh thu, chi phí và chỉ số vận hành; kiểm tra tính chính xác của báo cáo; sử dụng thông tin hiệu suất để điều chỉnh hoạt động tại đơn vị.</w:t>
-      </w:r>
-    </w:p>
-    <w:p>
-      <w:pPr>
-        <w:spacing w:after="0" w:line="360" w:lineRule="auto"/>
-        <w:ind w:left="259"/>
-        <w:rPr>
-          <w:b/>
-          <w:bCs/>
-        </w:rPr>
-      </w:pPr>
-      <w:r>
-        <w:rPr>
-          <w:b/>
-          <w:bCs/>
-        </w:rPr>
-        <w:t>2.x.2.</w:t>
-      </w:r>
-      <w:r>
-        <w:rPr>
-          <w:b/>
-          <w:bCs/>
-        </w:rPr>
-        <w:t>5</w:t>
-      </w:r>
-      <w:r>
-        <w:rPr>
-          <w:b/>
-          <w:bCs/>
-        </w:rPr>
-        <w:t>. Kết quả của quy trình</w:t>
-      </w:r>
-    </w:p>
-    <w:p>
-      <w:pPr>
-        <w:spacing w:after="0" w:line="360" w:lineRule="auto"/>
-        <w:ind w:left="259"/>
-      </w:pPr>
-      <w:r>
-        <w:rPr>
-          <w:b/>
-          <w:color w:val="000000" w:themeColor="text1"/>
-        </w:rPr>
-        <w:t xml:space="preserve">Kết quả thành công: </w:t>
-      </w:r>
-      <w:r>
-        <w:t>Ngân sách được phân bổ minh bạch, số liệu thực tế được đối chiếu và các chênh lệch trọng yếu có chủ sở hữu cùng hành động khắc phục.</w:t>
-      </w:r>
-    </w:p>
-    <w:p>
-      <w:pPr>
-        <w:spacing w:after="0" w:line="360" w:lineRule="auto"/>
-        <w:ind w:left="259"/>
-        <w:rPr>
-          <w:color w:val="000000" w:themeColor="text1"/>
-        </w:rPr>
-      </w:pPr>
-      <w:r>
-        <w:rPr>
-          <w:b/>
-          <w:szCs w:val="26"/>
-        </w:rPr>
-        <w:t>Các khả năng kết quả khác</w:t>
-      </w:r>
-      <w:r>
-        <w:rPr>
-          <w:b/>
-          <w:color w:val="000000" w:themeColor="text1"/>
-        </w:rPr>
-        <w:t>:</w:t>
-      </w:r>
-    </w:p>
-    <w:p>
-      <w:pPr>
-        <w:pStyle w:val="ListBullet"/>
-        <w:spacing w:line="360" w:lineRule="auto"/>
-      </w:pPr>
-      <w:r>
-        <w:lastRenderedPageBreak/>
-        <w:t>Dự toán bị trả lại do thiếu căn cứ, vượt trần ngân sách hoặc không phù hợp ưu tiên chiến lược.</w:t>
-      </w:r>
-    </w:p>
-    <w:p>
-      <w:pPr>
-        <w:pStyle w:val="ListBullet"/>
-        <w:spacing w:line="360" w:lineRule="auto"/>
-      </w:pPr>
-      <w:r>
-        <w:t>Báo cáo bị trì hoãn do dữ liệu POS/ERP thiếu, sai hoặc chưa đối soát.</w:t>
-      </w:r>
-    </w:p>
-    <w:p>
-      <w:pPr>
-        <w:pStyle w:val="ListBullet"/>
-        <w:spacing w:line="360" w:lineRule="auto"/>
-      </w:pPr>
-      <w:r>
-        <w:t>Ngân sách được điều chỉnh giữa kỳ vì doanh thu, chi phí hoặc nhu cầu đầu tư thay đổi.</w:t>
-      </w:r>
-    </w:p>
-    <w:p>
-      <w:pPr>
-        <w:spacing w:after="0" w:line="360" w:lineRule="auto"/>
-        <w:rPr>
-          <w:b/>
-          <w:bCs/>
-        </w:rPr>
-      </w:pPr>
-      <w:r>
-        <w:rPr>
-          <w:b/>
-          <w:bCs/>
-        </w:rPr>
-        <w:t>2.</w:t>
-      </w:r>
-      <w:r>
-        <w:rPr>
-          <w:b/>
-          <w:bCs/>
-        </w:rPr>
-        <w:t>x</w:t>
-      </w:r>
-      <w:r>
-        <w:rPr>
-          <w:b/>
-          <w:bCs/>
-        </w:rPr>
-        <w:t xml:space="preserve">.3. </w:t>
-      </w:r>
-      <w:r>
-        <w:rPr>
-          <w:b/>
-          <w:bCs/>
-        </w:rPr>
-        <w:t>MGT-03 Quản trị rủi ro, tuân thủ và chất lượng</w:t>
-      </w:r>
-    </w:p>
-    <w:p>
-      <w:pPr>
-        <w:rPr>
-          <w:b/>
-          <w:bCs/>
-        </w:rPr>
-      </w:pPr>
-      <w:r>
-        <w:rPr>
-          <w:b/>
-          <w:bCs/>
-        </w:rPr>
-        <w:t>2.x.</w:t>
-      </w:r>
-      <w:r>
-        <w:rPr>
-          <w:b/>
-          <w:bCs/>
-        </w:rPr>
-        <w:t>3</w:t>
-      </w:r>
-      <w:r>
-        <w:rPr>
-          <w:b/>
-          <w:bCs/>
-        </w:rPr>
-        <w:t>.1. Tổng quan quy trình</w:t>
-      </w:r>
-    </w:p>
-    <w:p>
-      <w:pPr>
+        <w:ind w:left="360"/>
+        <w:rPr>
+          <w:szCs w:val="26"/>
+        </w:rPr>
+      </w:pPr>
+      <w:r>
+        <w:rPr>
+          <w:szCs w:val="26"/>
+        </w:rPr>
+        <w:t>Bước 7: Ban điều hành tổng hợp, xử lý xung đột ưu tiên và trình phương án kế hoạch lên Hội đồng quản trị.</w:t>
+      </w:r>
+    </w:p>
+    <w:p>
+      <w:pPr>
+        <w:pStyle w:val="ListNumber"/>
         <w:keepLines/>
-        <w:spacing w:line="360" w:lineRule="auto"/>
-        <w:rPr>
-          <w:b/>
-        </w:rPr>
-      </w:pPr>
-      <w:r>
-        <w:t>Quy trình quản trị rủi ro, tuân thủ và chất lượng giúp FAHASA nhận diện, kiểm soát và xử lý các rủi ro, đồng thời bảo đảm hoạt động của doanh nghiệp đáp ứng yêu cầu pháp lý và tiêu chuẩn chất lượng.</w:t>
-      </w:r>
-      <w:r>
-        <w:rPr>
-          <w:b/>
-        </w:rPr>
-        <w:t xml:space="preserve"> </w:t>
-      </w:r>
-    </w:p>
-    <w:p>
-      <w:pPr>
-        <w:keepLines/>
-        <w:spacing w:line="360" w:lineRule="auto"/>
-      </w:pPr>
-      <w:r>
-        <w:rPr>
-          <w:b/>
-        </w:rPr>
-        <w:t xml:space="preserve">Mục đích: </w:t>
-      </w:r>
-      <w:r>
-        <w:t>Nhận diện và kiểm soát rủi ro có thể ảnh hưởng đến khách hàng, hàng hóa, dữ liệu, tài chính và uy tín; đồng thời duy trì yêu cầu tuân thủ và chất lượng dịch vụ.</w:t>
-      </w:r>
-    </w:p>
-    <w:p>
-      <w:pPr>
-        <w:keepLines/>
-        <w:spacing w:line="360" w:lineRule="auto"/>
-      </w:pPr>
-      <w:r>
-        <w:rPr>
-          <w:b/>
-        </w:rPr>
-        <w:t xml:space="preserve">Phạm vi: </w:t>
-      </w:r>
-      <w:r>
-        <w:t>Từ khi xây dựng danh mục nghĩa vụ/rủi ro hoặc ghi nhận sự cố đến khi biện pháp kiểm soát được thực hiện, xác minh và báo cáo đóng.</w:t>
-      </w:r>
-    </w:p>
-    <w:p>
-      <w:pPr>
-        <w:keepLines/>
-        <w:spacing w:line="360" w:lineRule="auto"/>
-      </w:pPr>
-      <w:r>
-        <w:rPr>
-          <w:b/>
-        </w:rPr>
-        <w:t xml:space="preserve">Điểm bắt đầu: </w:t>
-      </w:r>
-      <w:r>
-        <w:t>Bắt đầu kỳ đánh giá định kỳ, có yêu cầu pháp lý mới hoặc phát sinh sự cố/điểm không phù hợp.</w:t>
-      </w:r>
-    </w:p>
-    <w:p>
-      <w:pPr>
-        <w:keepLines/>
-        <w:spacing w:after="0" w:line="360" w:lineRule="auto"/>
-      </w:pPr>
-      <w:r>
-        <w:rPr>
-          <w:b/>
-        </w:rPr>
-        <w:t xml:space="preserve">Điểm kết thúc: </w:t>
-      </w:r>
-      <w:r>
-        <w:t>Rủi ro và điểm không phù hợp được xử lý đến mức chấp nhận, có bằng chứng xác minh và báo cáo cho cấp có thẩm quyền.</w:t>
-      </w:r>
-    </w:p>
-    <w:p>
-      <w:pPr>
-        <w:spacing w:after="0" w:line="360" w:lineRule="auto"/>
-        <w:rPr>
-          <w:b/>
-          <w:bCs/>
-          <w:szCs w:val="26"/>
-        </w:rPr>
-      </w:pPr>
-      <w:r>
-        <w:rPr>
-          <w:b/>
-          <w:bCs/>
-          <w:szCs w:val="26"/>
-        </w:rPr>
-        <w:t>2.x.3.</w:t>
-      </w:r>
-      <w:r>
-        <w:rPr>
-          <w:b/>
-          <w:bCs/>
-          <w:szCs w:val="26"/>
-        </w:rPr>
-        <w:t>2</w:t>
-      </w:r>
-      <w:r>
-        <w:rPr>
-          <w:b/>
-          <w:bCs/>
-          <w:szCs w:val="26"/>
-        </w:rPr>
-        <w:t xml:space="preserve">. </w:t>
-      </w:r>
-      <w:r>
-        <w:rPr>
-          <w:b/>
-          <w:bCs/>
-          <w:szCs w:val="26"/>
-        </w:rPr>
-        <w:t>Tác nhân tham gia</w:t>
-      </w:r>
-    </w:p>
-    <w:p>
-      <w:pPr>
-        <w:pStyle w:val="ListBullet"/>
-        <w:spacing w:line="360" w:lineRule="auto"/>
-      </w:pPr>
-      <w:r>
-        <w:t>Ban điều hành</w:t>
-      </w:r>
-      <w:r>
-        <w:t>:</w:t>
-      </w:r>
-      <w:r>
-        <w:t xml:space="preserve"> </w:t>
-      </w:r>
-    </w:p>
-    <w:p>
-      <w:pPr>
-        <w:pStyle w:val="ListBullet"/>
         <w:numPr>
           <w:ilvl w:val="0"/>
           <w:numId w:val="0"/>
         </w:numPr>
         <w:spacing w:line="360" w:lineRule="auto"/>
-        <w:ind w:left="539"/>
-      </w:pPr>
-      <w:r>
-        <w:t>Phê duyệt chính sách và nguồn lực kiểm soát, quyết định cách xử lý rủi ro vượt ngưỡng và theo dõi các vấn đề tuân thủ trọng yếu.</w:t>
-      </w:r>
-    </w:p>
-    <w:p>
-      <w:pPr>
-        <w:pStyle w:val="ListBullet"/>
-        <w:spacing w:line="360" w:lineRule="auto"/>
-      </w:pPr>
-      <w:r>
-        <w:t>Đầu mối quản trị rủi ro/tuân thủ</w:t>
-      </w:r>
-      <w:r>
-        <w:t xml:space="preserve">: </w:t>
-      </w:r>
-    </w:p>
-    <w:p>
-      <w:pPr>
-        <w:pStyle w:val="ListBullet"/>
+        <w:ind w:left="360"/>
+        <w:rPr>
+          <w:szCs w:val="26"/>
+        </w:rPr>
+      </w:pPr>
+      <w:r>
+        <w:rPr>
+          <w:szCs w:val="26"/>
+        </w:rPr>
+        <w:t>Bước 8: Hội đồng quản trị xem xét, yêu cầu điều chỉnh nếu cần và phê duyệt kế hoạch kinh doanh.</w:t>
+      </w:r>
+    </w:p>
+    <w:p>
+      <w:pPr>
+        <w:pStyle w:val="ListNumber"/>
+        <w:keepLines/>
         <w:numPr>
           <w:ilvl w:val="0"/>
           <w:numId w:val="0"/>
         </w:numPr>
         <w:spacing w:line="360" w:lineRule="auto"/>
-        <w:ind w:left="539"/>
-      </w:pPr>
-      <w:r>
-        <w:t>Cập nhật nghĩa vụ áp dụng, điều phối nhận diện và đánh giá rủi ro, duy trì danh mục theo dõi và tổng hợp trạng thái báo cáo.</w:t>
-      </w:r>
-    </w:p>
-    <w:p>
-      <w:pPr>
-        <w:pStyle w:val="ListBullet"/>
-        <w:spacing w:line="360" w:lineRule="auto"/>
-      </w:pPr>
-      <w:r>
-        <w:t>Bộ phận kiểm soát chất lượng</w:t>
-      </w:r>
-      <w:r>
-        <w:t xml:space="preserve">: </w:t>
+        <w:ind w:left="360"/>
+        <w:rPr>
+          <w:szCs w:val="26"/>
+        </w:rPr>
+      </w:pPr>
+      <w:r>
+        <w:rPr>
+          <w:szCs w:val="26"/>
+        </w:rPr>
+        <w:t>Bước 9: Ban điều hành truyền đạt kế hoạch, giao chỉ tiêu cho các đơn vị và thiết lập lịch rà soát định kỳ.</w:t>
+      </w:r>
+    </w:p>
+    <w:p>
+      <w:pPr>
+        <w:spacing w:after="0" w:line="360" w:lineRule="auto"/>
+        <w:rPr>
+          <w:b/>
+          <w:bCs/>
+          <w:szCs w:val="26"/>
+        </w:rPr>
+      </w:pPr>
+      <w:r>
+        <w:rPr>
+          <w:b/>
+          <w:bCs/>
+          <w:szCs w:val="26"/>
+        </w:rPr>
+        <w:t>2.x.1.</w:t>
+      </w:r>
+      <w:r>
+        <w:rPr>
+          <w:b/>
+          <w:bCs/>
+          <w:szCs w:val="26"/>
+        </w:rPr>
+        <w:t>4</w:t>
+      </w:r>
+      <w:r>
+        <w:rPr>
+          <w:b/>
+          <w:bCs/>
+          <w:szCs w:val="26"/>
+        </w:rPr>
+        <w:t xml:space="preserve">. </w:t>
+      </w:r>
+      <w:r>
+        <w:rPr>
+          <w:b/>
+          <w:bCs/>
+          <w:szCs w:val="26"/>
+        </w:rPr>
+        <w:t>Đối tượng khách hàng</w:t>
+      </w:r>
+    </w:p>
+    <w:p>
+      <w:pPr>
+        <w:keepLines/>
+        <w:spacing w:after="0" w:line="360" w:lineRule="auto"/>
+        <w:ind w:firstLine="360"/>
+        <w:rPr>
+          <w:bCs/>
+          <w:szCs w:val="26"/>
+        </w:rPr>
+      </w:pPr>
+      <w:r>
+        <w:rPr>
+          <w:bCs/>
+          <w:szCs w:val="26"/>
+        </w:rPr>
+        <w:t>Đối tượng của quy trình là Hội đồng quản trị, Ban điều hành, các khối, phòng ban, trung tâm, cửa hàng và các đơn vị được giao chỉ tiêu trong hệ thống FAHASA. Hội đồng quản trị và Ban điều hành sử dụng kết quả của quy trình để xem xét, phê duyệt và điều hành kế hoạch kinh doanh; các đơn vị tiếp nhận chỉ tiêu để xây dựng kế hoạch hành động, bố trí nguồn lực và tổ chức thực hiện.</w:t>
+      </w:r>
+    </w:p>
+    <w:p>
+      <w:pPr>
+        <w:keepLines/>
+        <w:spacing w:after="0" w:line="360" w:lineRule="auto"/>
+        <w:ind w:firstLine="360"/>
+        <w:rPr>
+          <w:bCs/>
+          <w:szCs w:val="26"/>
+        </w:rPr>
+      </w:pPr>
+      <w:r>
+        <w:rPr>
+          <w:bCs/>
+          <w:szCs w:val="26"/>
+        </w:rPr>
+        <w:t>Bên cạnh đó, cổ đông và chủ sở hữu cũng là đối tượng quan tâm đến kết quả của quy trình thông qua việc theo dõi định hướng phát triển, các mục tiêu và kết quả kỳ vọng của doanh nghiệp.</w:t>
+      </w:r>
+    </w:p>
+    <w:p>
+      <w:pPr>
+        <w:spacing w:after="0" w:line="360" w:lineRule="auto"/>
+        <w:rPr>
+          <w:b/>
+          <w:bCs/>
+          <w:szCs w:val="26"/>
+        </w:rPr>
+      </w:pPr>
+      <w:r>
+        <w:rPr>
+          <w:b/>
+          <w:bCs/>
+          <w:szCs w:val="26"/>
+        </w:rPr>
+        <w:t>2.x.1.</w:t>
+      </w:r>
+      <w:r>
+        <w:rPr>
+          <w:b/>
+          <w:bCs/>
+          <w:szCs w:val="26"/>
+        </w:rPr>
+        <w:t>5</w:t>
+      </w:r>
+      <w:r>
+        <w:rPr>
+          <w:b/>
+          <w:bCs/>
+          <w:szCs w:val="26"/>
+        </w:rPr>
+        <w:t>. Kết quả của quy trình</w:t>
       </w:r>
     </w:p>
     <w:p>
@@ -2634,74 +1558,511 @@
         </w:numPr>
         <w:spacing w:line="360" w:lineRule="auto"/>
         <w:ind w:left="539"/>
-      </w:pPr>
-      <w:r>
-        <w:t>Kiểm tra bằng chứng tuân thủ, đánh giá hiệu lực kiểm soát và xác minh việc khắc phục các điểm không phù hợp.</w:t>
-      </w:r>
-    </w:p>
-    <w:p>
-      <w:pPr>
-        <w:pStyle w:val="ListBullet"/>
-        <w:spacing w:line="360" w:lineRule="auto"/>
-      </w:pPr>
-      <w:r>
-        <w:t>Các chủ quy trình</w:t>
-      </w:r>
-      <w:r>
-        <w:t xml:space="preserve">: </w:t>
-      </w:r>
-    </w:p>
-    <w:p>
-      <w:pPr>
-        <w:pStyle w:val="ListBullet"/>
+        <w:rPr>
+          <w:color w:val="auto"/>
+          <w:sz w:val="24"/>
+          <w:szCs w:val="24"/>
+        </w:rPr>
+      </w:pPr>
+      <w:r>
+        <w:t>Sau khi hoàn thành, quy trình có thể tạo ra các kết quả sau:</w:t>
+      </w:r>
+    </w:p>
+    <w:p>
+      <w:pPr>
+        <w:pStyle w:val="ListBullet"/>
+        <w:spacing w:line="360" w:lineRule="auto"/>
+      </w:pPr>
+      <w:r>
+        <w:t>Kế hoạch kinh doanh được phê duyệt với mục tiêu, chỉ tiêu, chương trình hành động, nguồn lực và trách nhiệm thực hiện được xác định rõ ràng.</w:t>
+      </w:r>
+    </w:p>
+    <w:p>
+      <w:pPr>
+        <w:pStyle w:val="ListBullet"/>
+        <w:spacing w:line="360" w:lineRule="auto"/>
+      </w:pPr>
+      <w:r>
+        <w:t>Kế hoạch có thể được yêu cầu điều chỉnh nếu mục tiêu, phương án hoặc nguồn lực chưa bảo đảm tính khả thi.</w:t>
+      </w:r>
+    </w:p>
+    <w:p>
+      <w:pPr>
+        <w:pStyle w:val="ListBullet"/>
+        <w:spacing w:line="360" w:lineRule="auto"/>
+      </w:pPr>
+      <w:r>
+        <w:t>Quá trình phê duyệt có thể bị chậm khi dữ liệu đầu vào chưa đầy đủ hoặc các đơn vị chưa thống nhất về thứ tự ưu tiên.</w:t>
+      </w:r>
+    </w:p>
+    <w:p>
+      <w:pPr>
+        <w:pStyle w:val="ListBullet"/>
+        <w:spacing w:line="360" w:lineRule="auto"/>
+      </w:pPr>
+      <w:r>
+        <w:lastRenderedPageBreak/>
+        <w:t>Kế hoạch đã được phê duyệt có thể được cập nhật trong quá trình thực hiện khi thị trường, yêu cầu pháp lý hoặc năng lực vận hành có sự thay đổi đáng kể.</w:t>
+      </w:r>
+    </w:p>
+    <w:p>
+      <w:pPr>
+        <w:spacing w:after="0" w:line="360" w:lineRule="auto"/>
+        <w:rPr>
+          <w:b/>
+          <w:bCs/>
+        </w:rPr>
+      </w:pPr>
+      <w:r>
+        <w:rPr>
+          <w:b/>
+          <w:bCs/>
+        </w:rPr>
+        <w:t>2.</w:t>
+      </w:r>
+      <w:r>
+        <w:rPr>
+          <w:b/>
+          <w:bCs/>
+        </w:rPr>
+        <w:t>x</w:t>
+      </w:r>
+      <w:r>
+        <w:rPr>
+          <w:b/>
+          <w:bCs/>
+        </w:rPr>
+        <w:t xml:space="preserve">.2. </w:t>
+      </w:r>
+      <w:r>
+        <w:rPr>
+          <w:b/>
+          <w:bCs/>
+        </w:rPr>
+        <w:t>MGT-02 Lập ngân sách, giám sát doanh thu và quản trị hiệu suất</w:t>
+      </w:r>
+    </w:p>
+    <w:p>
+      <w:pPr>
+        <w:rPr>
+          <w:b/>
+          <w:bCs/>
+        </w:rPr>
+      </w:pPr>
+      <w:r>
+        <w:rPr>
+          <w:b/>
+          <w:bCs/>
+        </w:rPr>
+        <w:t>2.x.</w:t>
+      </w:r>
+      <w:r>
+        <w:rPr>
+          <w:b/>
+          <w:bCs/>
+        </w:rPr>
+        <w:t>2</w:t>
+      </w:r>
+      <w:r>
+        <w:rPr>
+          <w:b/>
+          <w:bCs/>
+        </w:rPr>
+        <w:t xml:space="preserve">.1. </w:t>
+      </w:r>
+      <w:r>
+        <w:rPr>
+          <w:b/>
+          <w:bCs/>
+        </w:rPr>
+        <w:t>Mục đích quy trình</w:t>
+      </w:r>
+    </w:p>
+    <w:p>
+      <w:pPr>
+        <w:keepLines/>
+        <w:spacing w:after="0" w:line="360" w:lineRule="auto"/>
+        <w:ind w:firstLine="360"/>
+      </w:pPr>
+      <w:r>
+        <w:t>Quy trình lập ngân sách, giám sát doanh thu và quản trị hiệu suất là quy trình quản lý giúp FAHASA chuyển các mục tiêu và kế hoạch kinh doanh đã được phê duyệt thành ngân sách, chỉ tiêu và nguồn lực cụ thể cho từng đơn vị.</w:t>
+      </w:r>
+    </w:p>
+    <w:p>
+      <w:pPr>
+        <w:keepLines/>
+        <w:spacing w:after="0" w:line="360" w:lineRule="auto"/>
+        <w:ind w:firstLine="360"/>
+      </w:pPr>
+      <w:r>
+        <w:t>Thông qua quy trình này, các đơn vị tiến hành lập dự toán doanh thu, chi phí, đầu tư và nhu cầu nhân lực dựa trên định hướng chung của doanh nghiệp. Bộ phận tài chính thực hiện kiểm tra các giả định, hợp nhất dự toán và cung cấp thông tin để Ban điều hành xem xét, điều chỉnh và phê duyệt mức ngân sách phù hợp.</w:t>
+      </w:r>
+    </w:p>
+    <w:p>
+      <w:pPr>
+        <w:keepLines/>
+        <w:spacing w:after="0" w:line="360" w:lineRule="auto"/>
+        <w:ind w:firstLine="360"/>
+      </w:pPr>
+      <w:r>
+        <w:t>Trong quá trình thực hiện, dữ liệu doanh thu, chi phí và các chỉ số vận hành được ghi nhận thông qua các hệ thống POS, ERP và BI. Số liệu thực tế được đối chiếu với ngân sách và kế hoạch để xác định các chênh lệch, làm cơ sở cho việc giải trình, điều chỉnh nguồn lực và cập nhật dự báo khi cần thiết. Qua đó, doanh nghiệp có thể kiểm soát hiệu quả việc sử dụng ngân sách và kịp thời điều chỉnh hoạt động kinh doanh.</w:t>
+      </w:r>
+    </w:p>
+    <w:p>
+      <w:pPr>
+        <w:spacing w:after="0" w:line="360" w:lineRule="auto"/>
+        <w:rPr>
+          <w:b/>
+          <w:bCs/>
+          <w:szCs w:val="26"/>
+        </w:rPr>
+      </w:pPr>
+      <w:r>
+        <w:rPr>
+          <w:b/>
+          <w:bCs/>
+          <w:szCs w:val="26"/>
+        </w:rPr>
+        <w:t>2.x.2.</w:t>
+      </w:r>
+      <w:r>
+        <w:rPr>
+          <w:b/>
+          <w:bCs/>
+          <w:szCs w:val="26"/>
+        </w:rPr>
+        <w:t>2</w:t>
+      </w:r>
+      <w:r>
+        <w:rPr>
+          <w:b/>
+          <w:bCs/>
+          <w:szCs w:val="26"/>
+        </w:rPr>
+        <w:t xml:space="preserve">. </w:t>
+      </w:r>
+      <w:r>
+        <w:rPr>
+          <w:b/>
+          <w:bCs/>
+          <w:szCs w:val="26"/>
+        </w:rPr>
+        <w:t>Tác nhân tham gia</w:t>
+      </w:r>
+    </w:p>
+    <w:p>
+      <w:pPr>
+        <w:pStyle w:val="ListBullet"/>
+        <w:spacing w:line="360" w:lineRule="auto"/>
+      </w:pPr>
+      <w:r>
+        <w:t>Ban điều hành</w:t>
+      </w:r>
+      <w:r>
+        <w:t>: Xem xét phương án ngân sách, quyết định mức phân bổ, phê duyệt dự báo cập nhật và giao hành động xử lý các chênh lệch trọng yếu.</w:t>
+      </w:r>
+    </w:p>
+    <w:p>
+      <w:pPr>
+        <w:pStyle w:val="ListBullet"/>
+        <w:spacing w:line="360" w:lineRule="auto"/>
+      </w:pPr>
+      <w:r>
+        <w:t>Bộ phận tài chính - kế toán</w:t>
+      </w:r>
+      <w:r>
+        <w:t>: Ban hành hướng dẫn dự toán, hợp nhất ngân sách, đối chiếu số thực tế, lập báo cáo hiệu suất và theo dõi hành động khắc phục.</w:t>
+      </w:r>
+    </w:p>
+    <w:p>
+      <w:pPr>
+        <w:pStyle w:val="ListBullet"/>
+        <w:spacing w:line="360" w:lineRule="auto"/>
+      </w:pPr>
+      <w:r>
+        <w:t>Trưởng các khối/phòng ban</w:t>
+      </w:r>
+      <w:r>
+        <w:t>: Lập dự toán của đơn vị, kiểm soát việc sử dụng ngân sách, giải trình chênh lệch và triển khai hành động cải thiện đã được giao.</w:t>
+      </w:r>
+    </w:p>
+    <w:p>
+      <w:pPr>
+        <w:pStyle w:val="ListBullet"/>
+        <w:spacing w:line="360" w:lineRule="auto"/>
+      </w:pPr>
+      <w:r>
+        <w:t>Quản lý cửa hàng và kênh trực tuyến</w:t>
+      </w:r>
+      <w:r>
+        <w:t>: Cung cấp dữ liệu doanh thu, chi phí và dự báo tại điểm vận hành; xác minh sai lệch và thực hiện biện pháp điều chỉnh tại đơn vị.</w:t>
+      </w:r>
+    </w:p>
+    <w:p>
+      <w:pPr>
+        <w:pStyle w:val="ListBullet"/>
+        <w:spacing w:line="360" w:lineRule="auto"/>
+      </w:pPr>
+      <w:r>
+        <w:t>Hệ thống POS/ERP/BI</w:t>
+      </w:r>
+      <w:r>
+        <w:t>: Ghi nhận và tổng hợp dữ liệu doanh thu, chi phí, ngân sách và chỉ số vận hành để cung cấp báo cáo nhất quán cho các cấp quản lý.</w:t>
+      </w:r>
+    </w:p>
+    <w:p>
+      <w:pPr>
+        <w:spacing w:after="0" w:line="360" w:lineRule="auto"/>
+      </w:pPr>
+      <w:r>
+        <w:rPr>
+          <w:b/>
+          <w:bCs/>
+          <w:szCs w:val="26"/>
+        </w:rPr>
+        <w:t>2.x.2.</w:t>
+      </w:r>
+      <w:r>
+        <w:rPr>
+          <w:b/>
+          <w:bCs/>
+          <w:szCs w:val="26"/>
+        </w:rPr>
+        <w:t>3</w:t>
+      </w:r>
+      <w:r>
+        <w:rPr>
+          <w:b/>
+          <w:bCs/>
+          <w:szCs w:val="26"/>
+        </w:rPr>
+        <w:t>. Mô tả quy trình:</w:t>
+      </w:r>
+    </w:p>
+    <w:p>
+      <w:pPr>
+        <w:spacing w:after="0" w:line="360" w:lineRule="auto"/>
+        <w:rPr>
+          <w:szCs w:val="26"/>
+        </w:rPr>
+      </w:pPr>
+      <w:r>
+        <w:rPr>
+          <w:szCs w:val="26"/>
+        </w:rPr>
+        <w:lastRenderedPageBreak/>
+        <w:t>Bước 1: Bộ phận tài chính tiếp nhận mục tiêu, chỉ tiêu và các sáng kiến đã được phê duyệt trong kế hoạch kinh doanh.</w:t>
+      </w:r>
+    </w:p>
+    <w:p>
+      <w:pPr>
+        <w:spacing w:after="0" w:line="360" w:lineRule="auto"/>
+        <w:rPr>
+          <w:szCs w:val="26"/>
+        </w:rPr>
+      </w:pPr>
+      <w:r>
+        <w:rPr>
+          <w:szCs w:val="26"/>
+        </w:rPr>
+        <w:t>Bước 2: Các đơn vị lập dự toán doanh thu, chi phí, đầu tư và nhu cầu nhân lực theo hướng dẫn chung.</w:t>
+      </w:r>
+    </w:p>
+    <w:p>
+      <w:pPr>
+        <w:spacing w:after="0" w:line="360" w:lineRule="auto"/>
+        <w:rPr>
+          <w:szCs w:val="26"/>
+        </w:rPr>
+      </w:pPr>
+      <w:r>
+        <w:rPr>
+          <w:szCs w:val="26"/>
+        </w:rPr>
+        <w:t>Bước 3: Bộ phận tài chính kiểm tra giả định, chuẩn hóa biểu mẫu và hợp nhất dự toán toàn doanh nghiệp.</w:t>
+      </w:r>
+    </w:p>
+    <w:p>
+      <w:pPr>
+        <w:spacing w:after="0" w:line="360" w:lineRule="auto"/>
+        <w:rPr>
+          <w:szCs w:val="26"/>
+        </w:rPr>
+      </w:pPr>
+      <w:r>
+        <w:rPr>
+          <w:szCs w:val="26"/>
+        </w:rPr>
+        <w:t>Bước 4: Ban điều hành xem xét các phương án, điều chỉnh mức phân bổ và phê duyệt ngân sách theo đơn vị.</w:t>
+      </w:r>
+    </w:p>
+    <w:p>
+      <w:pPr>
+        <w:spacing w:after="0" w:line="360" w:lineRule="auto"/>
+        <w:rPr>
+          <w:szCs w:val="26"/>
+        </w:rPr>
+      </w:pPr>
+      <w:r>
+        <w:rPr>
+          <w:szCs w:val="26"/>
+        </w:rPr>
+        <w:t>Bước 5: Hệ thống POS/ERP/BI ghi nhận doanh thu, chi phí và các chỉ số vận hành phát sinh trong kỳ.</w:t>
+      </w:r>
+    </w:p>
+    <w:p>
+      <w:pPr>
+        <w:spacing w:after="0" w:line="360" w:lineRule="auto"/>
+        <w:rPr>
+          <w:szCs w:val="26"/>
+        </w:rPr>
+      </w:pPr>
+      <w:r>
+        <w:rPr>
+          <w:szCs w:val="26"/>
+        </w:rPr>
+        <w:t>Bước 6: Bộ phận tài chính đối chiếu số thực tế với ngân sách, kế hoạch và cùng kỳ để xác định chênh lệch.</w:t>
+      </w:r>
+    </w:p>
+    <w:p>
+      <w:pPr>
+        <w:spacing w:after="0" w:line="360" w:lineRule="auto"/>
+        <w:rPr>
+          <w:szCs w:val="26"/>
+        </w:rPr>
+      </w:pPr>
+      <w:r>
+        <w:rPr>
+          <w:szCs w:val="26"/>
+        </w:rPr>
+        <w:t>Bước 7: Trưởng đơn vị giải trình nguyên nhân chênh lệch và đề xuất hành động cải thiện.</w:t>
+      </w:r>
+    </w:p>
+    <w:p>
+      <w:pPr>
+        <w:spacing w:after="0" w:line="360" w:lineRule="auto"/>
+        <w:rPr>
+          <w:szCs w:val="26"/>
+        </w:rPr>
+      </w:pPr>
+      <w:r>
+        <w:rPr>
+          <w:szCs w:val="26"/>
+        </w:rPr>
+        <w:t>Bước 8: Ban điều hành ưu tiên hành động, điều chuyển nguồn lực hoặc cập nhật dự báo khi cần.</w:t>
+      </w:r>
+    </w:p>
+    <w:p>
+      <w:pPr>
+        <w:spacing w:after="0" w:line="360" w:lineRule="auto"/>
+        <w:rPr>
+          <w:szCs w:val="26"/>
+        </w:rPr>
+      </w:pPr>
+      <w:r>
+        <w:rPr>
+          <w:szCs w:val="26"/>
+        </w:rPr>
+        <w:t>Bước 9: Bộ phận tài chính phát hành báo cáo hiệu suất kỳ và theo dõi việc hoàn thành hành động khắc phục.</w:t>
+      </w:r>
+    </w:p>
+    <w:p>
+      <w:pPr>
+        <w:spacing w:after="0" w:line="360" w:lineRule="auto"/>
+      </w:pPr>
+      <w:r>
+        <w:rPr>
+          <w:b/>
+          <w:bCs/>
+          <w:szCs w:val="26"/>
+        </w:rPr>
+        <w:t>2.x.2.</w:t>
+      </w:r>
+      <w:r>
+        <w:rPr>
+          <w:b/>
+          <w:bCs/>
+          <w:szCs w:val="26"/>
+        </w:rPr>
+        <w:t>4</w:t>
+      </w:r>
+      <w:r>
+        <w:rPr>
+          <w:b/>
+          <w:bCs/>
+          <w:szCs w:val="26"/>
+        </w:rPr>
+        <w:t xml:space="preserve">. </w:t>
+      </w:r>
+      <w:r>
+        <w:rPr>
+          <w:b/>
+          <w:bCs/>
+          <w:szCs w:val="26"/>
+        </w:rPr>
+        <w:t>Đối tượng khách hàng</w:t>
+      </w:r>
+    </w:p>
+    <w:p>
+      <w:pPr>
+        <w:pStyle w:val="ListBullet"/>
+        <w:keepLines/>
         <w:numPr>
           <w:ilvl w:val="0"/>
           <w:numId w:val="0"/>
         </w:numPr>
-        <w:spacing w:line="360" w:lineRule="auto"/>
-        <w:ind w:left="539"/>
-      </w:pPr>
-      <w:r>
-        <w:lastRenderedPageBreak/>
-        <w:t>Nhận diện rủi ro trong phạm vi phụ trách, thiết kế và thực hiện kiểm soát, phân tích nguyên nhân và hoàn thành hành động khắc phục.</w:t>
-      </w:r>
-    </w:p>
-    <w:p>
-      <w:pPr>
-        <w:pStyle w:val="ListBullet"/>
-        <w:spacing w:line="360" w:lineRule="auto"/>
-      </w:pPr>
-      <w:r>
-        <w:t>Bộ phận công nghệ thông tin/an toàn thông tin</w:t>
-      </w:r>
-      <w:r>
-        <w:t xml:space="preserve">: </w:t>
-      </w:r>
-    </w:p>
-    <w:p>
-      <w:pPr>
-        <w:pStyle w:val="ListBullet"/>
+        <w:spacing w:after="0" w:line="360" w:lineRule="auto"/>
+        <w:ind w:firstLine="360"/>
+        <w:contextualSpacing w:val="0"/>
+      </w:pPr>
+      <w:r>
+        <w:t xml:space="preserve">Đối tượng của quy trình là Ban điều hành, Hội đồng quản trị, các trưởng đơn vị quản lý ngân sách và các đơn vị vận hành trong hệ thống FAHASA. Ban điều hành và Hội đồng quản trị sử dụng các thông tin về ngân sách, doanh thu, chi phí và hiệu suất để đưa ra quyết định phân bổ hoặc điều chỉnh nguồn lực. </w:t>
+      </w:r>
+    </w:p>
+    <w:p>
+      <w:pPr>
+        <w:pStyle w:val="ListBullet"/>
+        <w:keepLines/>
         <w:numPr>
           <w:ilvl w:val="0"/>
           <w:numId w:val="0"/>
         </w:numPr>
-        <w:spacing w:line="360" w:lineRule="auto"/>
-        <w:ind w:left="539"/>
-      </w:pPr>
-      <w:r>
-        <w:t>Triển khai kiểm soát liên quan đến hệ thống, dữ liệu và quyền truy cập; điều tra và phối hợp xử lý các sự cố công nghệ hoặc bảo mật.</w:t>
-      </w:r>
-    </w:p>
-    <w:p>
-      <w:pPr>
-        <w:pStyle w:val="ListBullet"/>
-        <w:spacing w:line="360" w:lineRule="auto"/>
-      </w:pPr>
-      <w:r>
-        <w:t>Kiểm toán nội bộ hoặc đơn vị đánh giá độc lập</w:t>
-      </w:r>
-      <w:r>
-        <w:t xml:space="preserve">: </w:t>
+        <w:spacing w:after="0" w:line="360" w:lineRule="auto"/>
+        <w:ind w:firstLine="360"/>
+        <w:contextualSpacing w:val="0"/>
+      </w:pPr>
+      <w:r>
+        <w:t>Các trưởng đơn vị sử dụng ngân sách được giao để tổ chức hoạt động, theo dõi chi tiêu, giải trình các chênh lệch và thực hiện các hành động cải thiện. Các đơn vị vận hành sử dụng thông tin hiệu suất để kiểm tra kết quả thực tế và điều chỉnh hoạt động tại đơn vị mình.</w:t>
+      </w:r>
+    </w:p>
+    <w:p>
+      <w:pPr>
+        <w:spacing w:after="0" w:line="360" w:lineRule="auto"/>
+        <w:rPr>
+          <w:b/>
+          <w:bCs/>
+        </w:rPr>
+      </w:pPr>
+      <w:r>
+        <w:rPr>
+          <w:b/>
+          <w:bCs/>
+        </w:rPr>
+        <w:t>2.x.2.</w:t>
+      </w:r>
+      <w:r>
+        <w:rPr>
+          <w:b/>
+          <w:bCs/>
+        </w:rPr>
+        <w:t>5</w:t>
+      </w:r>
+      <w:r>
+        <w:rPr>
+          <w:b/>
+          <w:bCs/>
+        </w:rPr>
+        <w:t>. Kết quả của quy trình</w:t>
       </w:r>
     </w:p>
     <w:p>
@@ -2715,12 +2076,160 @@
         <w:ind w:left="539"/>
       </w:pPr>
       <w:r>
-        <w:t>Thực hiện đánh giá khách quan về mức tuân thủ và hiệu lực kiểm soát, lập phát hiện và kiến nghị cải thiện cho cấp có thẩm quyền.</w:t>
-      </w:r>
-    </w:p>
-    <w:p>
-      <w:pPr>
-        <w:spacing w:after="0" w:line="360" w:lineRule="auto"/>
+        <w:t>Sau khi hoàn thành, quy trình có thể tạo ra các kết quả sau:</w:t>
+      </w:r>
+    </w:p>
+    <w:p>
+      <w:pPr>
+        <w:pStyle w:val="ListBullet"/>
+        <w:spacing w:line="360" w:lineRule="auto"/>
+      </w:pPr>
+      <w:r>
+        <w:lastRenderedPageBreak/>
+        <w:t>Ngân sách được phân bổ cho các đơn vị, số liệu thực tế được đối chiếu với kế hoạch và các chênh lệch trọng yếu được xác định cùng với người chịu trách nhiệm xử lý.</w:t>
+      </w:r>
+    </w:p>
+    <w:p>
+      <w:pPr>
+        <w:pStyle w:val="ListBullet"/>
+        <w:spacing w:line="360" w:lineRule="auto"/>
+      </w:pPr>
+      <w:r>
+        <w:t>Dự toán có thể được yêu cầu lập lại hoặc điều chỉnh khi thiếu căn cứ, vượt giới hạn ngân sách hoặc chưa phù hợp với các ưu tiên chiến lược.</w:t>
+      </w:r>
+    </w:p>
+    <w:p>
+      <w:pPr>
+        <w:pStyle w:val="ListBullet"/>
+        <w:spacing w:line="360" w:lineRule="auto"/>
+      </w:pPr>
+      <w:r>
+        <w:t>Báo cáo hiệu suất có thể bị trì hoãn khi dữ liệu từ hệ thống POS, ERP hoặc các nguồn liên quan bị thiếu, sai lệch hoặc chưa được đối soát.</w:t>
+      </w:r>
+    </w:p>
+    <w:p>
+      <w:pPr>
+        <w:pStyle w:val="ListBullet"/>
+        <w:tabs>
+          <w:tab w:val="clear" w:pos="360"/>
+        </w:tabs>
+        <w:spacing w:line="360" w:lineRule="auto"/>
+      </w:pPr>
+      <w:r>
+        <w:t>Ngân sách và dự báo có thể được điều chỉnh trong kỳ khi doanh thu, chi phí hoặc nhu cầu đầu tư thay đổi so với kế hoạch ban đầu.</w:t>
+      </w:r>
+    </w:p>
+    <w:p>
+      <w:pPr>
+        <w:spacing w:after="0" w:line="360" w:lineRule="auto"/>
+        <w:rPr>
+          <w:b/>
+          <w:bCs/>
+        </w:rPr>
+      </w:pPr>
+      <w:r>
+        <w:rPr>
+          <w:b/>
+          <w:bCs/>
+        </w:rPr>
+        <w:t>2.</w:t>
+      </w:r>
+      <w:r>
+        <w:rPr>
+          <w:b/>
+          <w:bCs/>
+        </w:rPr>
+        <w:t>x</w:t>
+      </w:r>
+      <w:r>
+        <w:rPr>
+          <w:b/>
+          <w:bCs/>
+        </w:rPr>
+        <w:t xml:space="preserve">.3. </w:t>
+      </w:r>
+      <w:r>
+        <w:rPr>
+          <w:b/>
+          <w:bCs/>
+        </w:rPr>
+        <w:t>MGT-03 Quản trị rủi ro, tuân thủ và chất lượng</w:t>
+      </w:r>
+    </w:p>
+    <w:p>
+      <w:pPr>
+        <w:rPr>
+          <w:b/>
+          <w:bCs/>
+        </w:rPr>
+      </w:pPr>
+      <w:r>
+        <w:rPr>
+          <w:b/>
+          <w:bCs/>
+        </w:rPr>
+        <w:t>2.x.</w:t>
+      </w:r>
+      <w:r>
+        <w:rPr>
+          <w:b/>
+          <w:bCs/>
+        </w:rPr>
+        <w:t>3</w:t>
+      </w:r>
+      <w:r>
+        <w:rPr>
+          <w:b/>
+          <w:bCs/>
+        </w:rPr>
+        <w:t xml:space="preserve">.1. </w:t>
+      </w:r>
+      <w:r>
+        <w:rPr>
+          <w:b/>
+          <w:bCs/>
+        </w:rPr>
+        <w:t>Mục đích quy trình</w:t>
+      </w:r>
+    </w:p>
+    <w:p>
+      <w:pPr>
+        <w:keepLines/>
+        <w:spacing w:after="0" w:line="360" w:lineRule="auto"/>
+        <w:ind w:firstLine="360"/>
+      </w:pPr>
+      <w:r>
+        <w:t>Quy trình quản trị rủi ro, tuân thủ và chất lượng là quy trình quản lý giúp FAHASA nhận diện, đánh giá và kiểm soát các rủi ro có thể ảnh hưởng đến hoạt động kinh doanh, khách hàng, hàng hóa, dữ liệu, tài chính và uy tín của doanh nghiệp.</w:t>
+      </w:r>
+    </w:p>
+    <w:p>
+      <w:pPr>
+        <w:keepLines/>
+        <w:spacing w:after="0" w:line="360" w:lineRule="auto"/>
+        <w:ind w:firstLine="360"/>
+      </w:pPr>
+      <w:r>
+        <w:t>Thông qua quy trình này, các yêu cầu pháp luật, chính sách nội bộ, cam kết với khách hàng và tiêu chuẩn chất lượng được cập nhật và theo dõi thường xuyên. Các chủ quy trình tiến hành nhận diện rủi ro và các điểm kiểm soát quan trọng, sau đó đánh giá khả năng xảy ra và mức độ ảnh hưởng để xác định mức độ ưu tiên xử lý.</w:t>
+      </w:r>
+    </w:p>
+    <w:p>
+      <w:pPr>
+        <w:keepLines/>
+        <w:spacing w:after="0" w:line="360" w:lineRule="auto"/>
+        <w:ind w:firstLine="360"/>
+      </w:pPr>
+      <w:r>
+        <w:t>Các biện pháp phòng ngừa, phát hiện và ứng phó được xây dựng và triển khai tại các đơn vị liên quan. Đồng thời, bộ phận chất lượng hoặc kiểm toán thực hiện kiểm tra mức độ tuân thủ và hiệu lực của các biện pháp kiểm soát. Những điểm không phù hợp hoặc sự cố phát sinh được phân tích nguyên nhân, thực hiện khắc phục và tiếp tục theo dõi cho đến khi rủi ro được xử lý ở mức chấp nhận được.</w:t>
+      </w:r>
+    </w:p>
+    <w:p>
+      <w:pPr>
+        <w:spacing w:after="0" w:line="360" w:lineRule="auto"/>
+        <w:rPr>
+          <w:b/>
+          <w:bCs/>
+          <w:szCs w:val="26"/>
+        </w:rPr>
       </w:pPr>
       <w:r>
         <w:rPr>
@@ -2736,162 +2245,7 @@
           <w:bCs/>
           <w:szCs w:val="26"/>
         </w:rPr>
-        <w:t>3</w:t>
-      </w:r>
-      <w:r>
-        <w:rPr>
-          <w:b/>
-          <w:bCs/>
-          <w:szCs w:val="26"/>
-        </w:rPr>
-        <w:t>. Mô tả quy trình</w:t>
-      </w:r>
-    </w:p>
-    <w:p>
-      <w:pPr>
-        <w:pStyle w:val="ListNumber"/>
-        <w:keepLines/>
-        <w:numPr>
-          <w:ilvl w:val="0"/>
-          <w:numId w:val="4"/>
-        </w:numPr>
-        <w:spacing w:line="360" w:lineRule="auto"/>
-      </w:pPr>
-      <w:r>
-        <w:t>Đầu mối tuân thủ cập nhật yêu cầu pháp luật, chính sách nội bộ, cam kết với khách hàng và tiêu chuẩn chất lượng áp dụng.</w:t>
-      </w:r>
-    </w:p>
-    <w:p>
-      <w:pPr>
-        <w:pStyle w:val="ListNumber"/>
-        <w:keepLines/>
-        <w:numPr>
-          <w:ilvl w:val="0"/>
-          <w:numId w:val="4"/>
-        </w:numPr>
-        <w:spacing w:line="360" w:lineRule="auto"/>
-      </w:pPr>
-      <w:r>
-        <w:t>Các chủ quy trình nhận diện rủi ro, sự cố và điểm kiểm soát quan trọng trong phạm vi mình phụ trách.</w:t>
-      </w:r>
-    </w:p>
-    <w:p>
-      <w:pPr>
-        <w:pStyle w:val="ListNumber"/>
-        <w:keepLines/>
-        <w:numPr>
-          <w:ilvl w:val="0"/>
-          <w:numId w:val="4"/>
-        </w:numPr>
-        <w:spacing w:line="360" w:lineRule="auto"/>
-      </w:pPr>
-      <w:r>
-        <w:t>Đầu mối rủi ro đánh giá khả năng xảy ra, mức độ ảnh hưởng và xếp hạng ưu tiên xử lý.</w:t>
-      </w:r>
-    </w:p>
-    <w:p>
-      <w:pPr>
-        <w:pStyle w:val="ListNumber"/>
-        <w:keepLines/>
-        <w:numPr>
-          <w:ilvl w:val="0"/>
-          <w:numId w:val="4"/>
-        </w:numPr>
-        <w:spacing w:line="360" w:lineRule="auto"/>
-      </w:pPr>
-      <w:r>
-        <w:t>Chủ quy trình xác định biện pháp phòng ngừa, phát hiện, ứng phó và người chịu trách nhiệm.</w:t>
-      </w:r>
-    </w:p>
-    <w:p>
-      <w:pPr>
-        <w:pStyle w:val="ListNumber"/>
-        <w:keepLines/>
-        <w:numPr>
-          <w:ilvl w:val="0"/>
-          <w:numId w:val="4"/>
-        </w:numPr>
-        <w:spacing w:line="360" w:lineRule="auto"/>
-      </w:pPr>
-      <w:r>
-        <w:t>Ban điều hành xem xét các rủi ro vượt ngưỡng và phê duyệt nguồn lực xử lý.</w:t>
-      </w:r>
-    </w:p>
-    <w:p>
-      <w:pPr>
-        <w:pStyle w:val="ListNumber"/>
-        <w:keepLines/>
-        <w:numPr>
-          <w:ilvl w:val="0"/>
-          <w:numId w:val="4"/>
-        </w:numPr>
-        <w:spacing w:line="360" w:lineRule="auto"/>
-      </w:pPr>
-      <w:r>
-        <w:t>Các đơn vị triển khai kiểm soát, đào tạo nhân viên và lưu bằng chứng thực hiện.</w:t>
-      </w:r>
-    </w:p>
-    <w:p>
-      <w:pPr>
-        <w:pStyle w:val="ListNumber"/>
-        <w:keepLines/>
-        <w:numPr>
-          <w:ilvl w:val="0"/>
-          <w:numId w:val="4"/>
-        </w:numPr>
-        <w:spacing w:line="360" w:lineRule="auto"/>
-      </w:pPr>
-      <w:r>
-        <w:t>Bộ phận chất lượng hoặc kiểm toán kiểm tra mức tuân thủ và hiệu lực của biện pháp.</w:t>
-      </w:r>
-    </w:p>
-    <w:p>
-      <w:pPr>
-        <w:pStyle w:val="ListNumber"/>
-        <w:keepLines/>
-        <w:numPr>
-          <w:ilvl w:val="0"/>
-          <w:numId w:val="4"/>
-        </w:numPr>
-        <w:spacing w:line="360" w:lineRule="auto"/>
-      </w:pPr>
-      <w:r>
-        <w:t>Chủ quy trình khắc phục điểm không phù hợp, phân tích nguyên nhân và ngăn ngừa tái diễn.</w:t>
-      </w:r>
-    </w:p>
-    <w:p>
-      <w:pPr>
-        <w:pStyle w:val="ListNumber"/>
-        <w:keepLines/>
-        <w:numPr>
-          <w:ilvl w:val="0"/>
-          <w:numId w:val="4"/>
-        </w:numPr>
-        <w:spacing w:line="360" w:lineRule="auto"/>
-      </w:pPr>
-      <w:r>
-        <w:t>Đầu mối rủi ro tổng hợp trạng thái, báo cáo Ban điều hành và đóng hoặc tiếp tục theo dõi rủi ro.</w:t>
-      </w:r>
-    </w:p>
-    <w:p>
-      <w:pPr>
-        <w:spacing w:after="0" w:line="360" w:lineRule="auto"/>
-      </w:pPr>
-      <w:r>
-        <w:rPr>
-          <w:b/>
-          <w:bCs/>
-          <w:szCs w:val="26"/>
-        </w:rPr>
-        <w:t>2.x.3.</w:t>
-      </w:r>
-      <w:r>
-        <w:rPr>
-          <w:b/>
-          <w:bCs/>
-          <w:szCs w:val="26"/>
-        </w:rPr>
-        <w:t>4</w:t>
+        <w:t>2</w:t>
       </w:r>
       <w:r>
         <w:rPr>
@@ -2907,19 +2261,22 @@
           <w:bCs/>
           <w:szCs w:val="26"/>
         </w:rPr>
-        <w:t>Khách hàng của quy trình</w:t>
-      </w:r>
-    </w:p>
-    <w:p>
-      <w:pPr>
-        <w:pStyle w:val="ListBullet"/>
-        <w:spacing w:line="360" w:lineRule="auto"/>
-      </w:pPr>
-      <w:r>
-        <w:t>Ban điều hành và các chủ quy trình</w:t>
-      </w:r>
-      <w:r>
-        <w:t xml:space="preserve">: </w:t>
+        <w:t>Tác nhân tham gia</w:t>
+      </w:r>
+    </w:p>
+    <w:p>
+      <w:pPr>
+        <w:pStyle w:val="ListBullet"/>
+        <w:spacing w:line="360" w:lineRule="auto"/>
+      </w:pPr>
+      <w:r>
+        <w:t>Ban điều hành</w:t>
+      </w:r>
+      <w:r>
+        <w:t>:</w:t>
+      </w:r>
+      <w:r>
+        <w:t xml:space="preserve"> </w:t>
       </w:r>
     </w:p>
     <w:p>
@@ -2933,16 +2290,16 @@
         <w:ind w:left="539"/>
       </w:pPr>
       <w:r>
-        <w:t>Nhận diện và báo cáo rủi ro; thực hiện biện pháp kiểm soát; cung cấp bằng chứng tuân thủ; xử lý điểm không phù hợp; theo dõi và báo cáo kết quả khắc phục. Ban điều hành phê duyệt phương án và nguồn lực xử lý rủi ro lớn.</w:t>
-      </w:r>
-    </w:p>
-    <w:p>
-      <w:pPr>
-        <w:pStyle w:val="ListBullet"/>
-        <w:spacing w:line="360" w:lineRule="auto"/>
-      </w:pPr>
-      <w:r>
-        <w:t>Khách hàng và đối tác cần dịch vụ an toàn, nhất quán</w:t>
+        <w:t>Phê duyệt chính sách và nguồn lực kiểm soát, quyết định cách xử lý rủi ro vượt ngưỡng và theo dõi các vấn đề tuân thủ trọng yếu.</w:t>
+      </w:r>
+    </w:p>
+    <w:p>
+      <w:pPr>
+        <w:pStyle w:val="ListBullet"/>
+        <w:spacing w:line="360" w:lineRule="auto"/>
+      </w:pPr>
+      <w:r>
+        <w:t>Đầu mối quản trị rủi ro/tuân thủ</w:t>
       </w:r>
       <w:r>
         <w:t xml:space="preserve">: </w:t>
@@ -2959,17 +2316,17 @@
         <w:ind w:left="539"/>
       </w:pPr>
       <w:r>
+        <w:t>Cập nhật nghĩa vụ áp dụng, điều phối nhận diện và đánh giá rủi ro, duy trì danh mục theo dõi và tổng hợp trạng thái báo cáo.</w:t>
+      </w:r>
+    </w:p>
+    <w:p>
+      <w:pPr>
+        <w:pStyle w:val="ListBullet"/>
+        <w:spacing w:line="360" w:lineRule="auto"/>
+      </w:pPr>
+      <w:r>
         <w:lastRenderedPageBreak/>
-        <w:t>Tuân thủ các điều kiện giao dịch; cung cấp thông tin hoặc bằng chứng khi phát sinh sự cố; phản ánh vấn đề về an toàn, chất lượng hoặc bảo mật; phối hợp xác minh và xác nhận kết quả xử lý.</w:t>
-      </w:r>
-    </w:p>
-    <w:p>
-      <w:pPr>
-        <w:pStyle w:val="ListBullet"/>
-        <w:spacing w:line="360" w:lineRule="auto"/>
-      </w:pPr>
-      <w:r>
-        <w:t>Cơ quan quản lý và bên đánh giá cần bằng chứng tuân thủ</w:t>
+        <w:t>Bộ phận kiểm soát chất lượng</w:t>
       </w:r>
       <w:r>
         <w:t xml:space="preserve">: </w:t>
@@ -2982,11 +2339,307 @@
           <w:ilvl w:val="0"/>
           <w:numId w:val="0"/>
         </w:numPr>
-        <w:spacing w:after="0" w:line="360" w:lineRule="auto"/>
-        <w:ind w:left="533"/>
-      </w:pPr>
-      <w:r>
-        <w:t>Kiểm tra hồ sơ và bằng chứng tuân thủ; thực hiện thanh tra hoặc đánh giá; lập phát hiện; yêu cầu khắc phục; xác nhận mức độ đáp ứng sau khi doanh nghiệp hoàn thành xử lý.</w:t>
+        <w:spacing w:line="360" w:lineRule="auto"/>
+        <w:ind w:left="539"/>
+      </w:pPr>
+      <w:r>
+        <w:t>Kiểm tra bằng chứng tuân thủ, đánh giá hiệu lực kiểm soát và xác minh việc khắc phục các điểm không phù hợp.</w:t>
+      </w:r>
+    </w:p>
+    <w:p>
+      <w:pPr>
+        <w:pStyle w:val="ListBullet"/>
+        <w:spacing w:line="360" w:lineRule="auto"/>
+      </w:pPr>
+      <w:r>
+        <w:t>Các chủ quy trình</w:t>
+      </w:r>
+      <w:r>
+        <w:t xml:space="preserve">: </w:t>
+      </w:r>
+    </w:p>
+    <w:p>
+      <w:pPr>
+        <w:pStyle w:val="ListBullet"/>
+        <w:numPr>
+          <w:ilvl w:val="0"/>
+          <w:numId w:val="0"/>
+        </w:numPr>
+        <w:spacing w:line="360" w:lineRule="auto"/>
+        <w:ind w:left="539"/>
+      </w:pPr>
+      <w:r>
+        <w:t>Nhận diện rủi ro trong phạm vi phụ trách, thiết kế và thực hiện kiểm soát, phân tích nguyên nhân và hoàn thành hành động khắc phục.</w:t>
+      </w:r>
+    </w:p>
+    <w:p>
+      <w:pPr>
+        <w:pStyle w:val="ListBullet"/>
+        <w:spacing w:line="360" w:lineRule="auto"/>
+      </w:pPr>
+      <w:r>
+        <w:t>Bộ phận công nghệ thông tin/an toàn thông tin</w:t>
+      </w:r>
+      <w:r>
+        <w:t xml:space="preserve">: </w:t>
+      </w:r>
+    </w:p>
+    <w:p>
+      <w:pPr>
+        <w:pStyle w:val="ListBullet"/>
+        <w:numPr>
+          <w:ilvl w:val="0"/>
+          <w:numId w:val="0"/>
+        </w:numPr>
+        <w:spacing w:line="360" w:lineRule="auto"/>
+        <w:ind w:left="539"/>
+      </w:pPr>
+      <w:r>
+        <w:t>Triển khai kiểm soát liên quan đến hệ thống, dữ liệu và quyền truy cập; điều tra và phối hợp xử lý các sự cố công nghệ hoặc bảo mật.</w:t>
+      </w:r>
+    </w:p>
+    <w:p>
+      <w:pPr>
+        <w:pStyle w:val="ListBullet"/>
+        <w:spacing w:line="360" w:lineRule="auto"/>
+      </w:pPr>
+      <w:r>
+        <w:t>Kiểm toán nội bộ hoặc đơn vị đánh giá độc lập</w:t>
+      </w:r>
+      <w:r>
+        <w:t xml:space="preserve">: </w:t>
+      </w:r>
+    </w:p>
+    <w:p>
+      <w:pPr>
+        <w:pStyle w:val="ListBullet"/>
+        <w:numPr>
+          <w:ilvl w:val="0"/>
+          <w:numId w:val="0"/>
+        </w:numPr>
+        <w:spacing w:line="360" w:lineRule="auto"/>
+        <w:ind w:left="539"/>
+      </w:pPr>
+      <w:r>
+        <w:t>Thực hiện đánh giá khách quan về mức tuân thủ và hiệu lực kiểm soát, lập phát hiện và kiến nghị cải thiện cho cấp có thẩm quyền.</w:t>
+      </w:r>
+    </w:p>
+    <w:p>
+      <w:pPr>
+        <w:spacing w:after="0" w:line="360" w:lineRule="auto"/>
+      </w:pPr>
+      <w:r>
+        <w:rPr>
+          <w:b/>
+          <w:bCs/>
+          <w:szCs w:val="26"/>
+        </w:rPr>
+        <w:t>2.x.3.</w:t>
+      </w:r>
+      <w:r>
+        <w:rPr>
+          <w:b/>
+          <w:bCs/>
+          <w:szCs w:val="26"/>
+        </w:rPr>
+        <w:t>3</w:t>
+      </w:r>
+      <w:r>
+        <w:rPr>
+          <w:b/>
+          <w:bCs/>
+          <w:szCs w:val="26"/>
+        </w:rPr>
+        <w:t>. Mô tả quy trình</w:t>
+      </w:r>
+    </w:p>
+    <w:p>
+      <w:pPr>
+        <w:spacing w:after="0" w:line="360" w:lineRule="auto"/>
+        <w:rPr>
+          <w:szCs w:val="26"/>
+        </w:rPr>
+      </w:pPr>
+      <w:r>
+        <w:rPr>
+          <w:szCs w:val="26"/>
+        </w:rPr>
+        <w:t>Bước 1: Đầu mối tuân thủ cập nhật yêu cầu pháp luật, chính sách nội bộ, cam kết với khách hàng và tiêu chuẩn chất lượng áp dụng.</w:t>
+      </w:r>
+    </w:p>
+    <w:p>
+      <w:pPr>
+        <w:spacing w:after="0" w:line="360" w:lineRule="auto"/>
+        <w:rPr>
+          <w:szCs w:val="26"/>
+        </w:rPr>
+      </w:pPr>
+      <w:r>
+        <w:rPr>
+          <w:szCs w:val="26"/>
+        </w:rPr>
+        <w:t>Bước 2: Các chủ quy trình nhận diện rủi ro, sự cố và điểm kiểm soát quan trọng trong phạm vi mình phụ trách.</w:t>
+      </w:r>
+    </w:p>
+    <w:p>
+      <w:pPr>
+        <w:spacing w:after="0" w:line="360" w:lineRule="auto"/>
+        <w:rPr>
+          <w:szCs w:val="26"/>
+        </w:rPr>
+      </w:pPr>
+      <w:r>
+        <w:rPr>
+          <w:szCs w:val="26"/>
+        </w:rPr>
+        <w:t>Bước 3: Đầu mối rủi ro đánh giá khả năng xảy ra, mức độ ảnh hưởng và xếp hạng ưu tiên xử lý.</w:t>
+      </w:r>
+    </w:p>
+    <w:p>
+      <w:pPr>
+        <w:spacing w:after="0" w:line="360" w:lineRule="auto"/>
+        <w:rPr>
+          <w:szCs w:val="26"/>
+        </w:rPr>
+      </w:pPr>
+      <w:r>
+        <w:rPr>
+          <w:szCs w:val="26"/>
+        </w:rPr>
+        <w:t>Bước 4: Chủ quy trình xác định biện pháp phòng ngừa, phát hiện, ứng phó và người chịu trách nhiệm.</w:t>
+      </w:r>
+    </w:p>
+    <w:p>
+      <w:pPr>
+        <w:spacing w:after="0" w:line="360" w:lineRule="auto"/>
+        <w:rPr>
+          <w:szCs w:val="26"/>
+        </w:rPr>
+      </w:pPr>
+      <w:r>
+        <w:rPr>
+          <w:szCs w:val="26"/>
+        </w:rPr>
+        <w:t>Bước 5: Ban điều hành xem xét các rủi ro vượt ngưỡng và phê duyệt nguồn lực xử lý.</w:t>
+      </w:r>
+    </w:p>
+    <w:p>
+      <w:pPr>
+        <w:spacing w:after="0" w:line="360" w:lineRule="auto"/>
+        <w:rPr>
+          <w:szCs w:val="26"/>
+        </w:rPr>
+      </w:pPr>
+      <w:r>
+        <w:rPr>
+          <w:szCs w:val="26"/>
+        </w:rPr>
+        <w:t>Bước 6: Các đơn vị triển khai kiểm soát, đào tạo nhân viên và lưu bằng chứng thực hiện.</w:t>
+      </w:r>
+    </w:p>
+    <w:p>
+      <w:pPr>
+        <w:spacing w:after="0" w:line="360" w:lineRule="auto"/>
+        <w:rPr>
+          <w:szCs w:val="26"/>
+        </w:rPr>
+      </w:pPr>
+      <w:r>
+        <w:rPr>
+          <w:szCs w:val="26"/>
+        </w:rPr>
+        <w:t>Bước 7: Bộ phận chất lượng hoặc kiểm toán kiểm tra mức tuân thủ và hiệu lực của biện pháp.</w:t>
+      </w:r>
+    </w:p>
+    <w:p>
+      <w:pPr>
+        <w:spacing w:after="0" w:line="360" w:lineRule="auto"/>
+        <w:rPr>
+          <w:szCs w:val="26"/>
+        </w:rPr>
+      </w:pPr>
+      <w:r>
+        <w:rPr>
+          <w:szCs w:val="26"/>
+        </w:rPr>
+        <w:t>Bước 8: Chủ quy trình khắc phục điểm không phù hợp, phân tích nguyên nhân và ngăn ngừa tái diễn.</w:t>
+      </w:r>
+    </w:p>
+    <w:p>
+      <w:pPr>
+        <w:spacing w:after="0" w:line="360" w:lineRule="auto"/>
+        <w:rPr>
+          <w:szCs w:val="26"/>
+        </w:rPr>
+      </w:pPr>
+      <w:r>
+        <w:rPr>
+          <w:szCs w:val="26"/>
+        </w:rPr>
+        <w:t>Bước 9: Đầu mối rủi ro tổng hợp trạng thái, báo cáo Ban điều hành và đóng hoặc tiếp tục theo dõi rủi ro.</w:t>
+      </w:r>
+    </w:p>
+    <w:p>
+      <w:pPr>
+        <w:spacing w:after="0" w:line="360" w:lineRule="auto"/>
+        <w:rPr>
+          <w:b/>
+          <w:bCs/>
+          <w:szCs w:val="26"/>
+        </w:rPr>
+      </w:pPr>
+      <w:r>
+        <w:rPr>
+          <w:b/>
+          <w:bCs/>
+          <w:szCs w:val="26"/>
+        </w:rPr>
+        <w:t>2.x.3.</w:t>
+      </w:r>
+      <w:r>
+        <w:rPr>
+          <w:b/>
+          <w:bCs/>
+          <w:szCs w:val="26"/>
+        </w:rPr>
+        <w:t>4</w:t>
+      </w:r>
+      <w:r>
+        <w:rPr>
+          <w:b/>
+          <w:bCs/>
+          <w:szCs w:val="26"/>
+        </w:rPr>
+        <w:t xml:space="preserve">. </w:t>
+      </w:r>
+      <w:r>
+        <w:rPr>
+          <w:b/>
+          <w:bCs/>
+          <w:szCs w:val="26"/>
+        </w:rPr>
+        <w:t>Đối tượng khách hàng</w:t>
+      </w:r>
+    </w:p>
+    <w:p>
+      <w:pPr>
+        <w:keepLines/>
+        <w:spacing w:after="0" w:line="360" w:lineRule="auto"/>
+        <w:ind w:firstLine="360"/>
+      </w:pPr>
+      <w:r>
+        <w:lastRenderedPageBreak/>
+        <w:t>Đối tượng của quy trình là Ban điều hành, các chủ quy trình, khách hàng, đối tác, cơ quan quản lý và các đơn vị thực hiện đánh giá trong hoặc ngoài doanh nghiệp. Ban điều hành và các chủ quy trình sử dụng kết quả đánh giá rủi ro để lựa chọn biện pháp kiểm soát, bố trí nguồn lực và theo dõi việc khắc phục.</w:t>
+      </w:r>
+    </w:p>
+    <w:p>
+      <w:pPr>
+        <w:keepLines/>
+        <w:spacing w:after="0" w:line="360" w:lineRule="auto"/>
+        <w:ind w:firstLine="360"/>
+      </w:pPr>
+      <w:r>
+        <w:t>Khách hàng và đối tác được hưởng lợi từ việc các hoạt động, sản phẩm và dịch vụ của FAHASA được kiểm soát theo các yêu cầu về an toàn, chất lượng và bảo mật. Cơ quan quản lý và các bên đánh giá sử dụng hồ sơ, bằng chứng tuân thủ và kết quả khắc phục để kiểm tra mức độ đáp ứng các yêu cầu áp dụng.</w:t>
       </w:r>
     </w:p>
     <w:p>
@@ -3038,65 +2691,57 @@
     </w:p>
     <w:p>
       <w:pPr>
-        <w:spacing w:after="0" w:line="360" w:lineRule="auto"/>
-        <w:ind w:left="259"/>
-      </w:pPr>
-      <w:r>
-        <w:rPr>
-          <w:b/>
-          <w:color w:val="000000" w:themeColor="text1"/>
-        </w:rPr>
-        <w:t xml:space="preserve">Kết quả thành công: </w:t>
-      </w:r>
-      <w:r>
-        <w:t>Danh mục rủi ro và nghĩa vụ được cập nhật; kiểm soát trọng yếu hoạt động hiệu quả; sự cố/điểm không phù hợp được xử lý và xác minh.</w:t>
-      </w:r>
-    </w:p>
-    <w:p>
-      <w:pPr>
-        <w:spacing w:after="0" w:line="360" w:lineRule="auto"/>
-        <w:ind w:left="259"/>
-      </w:pPr>
-      <w:r>
-        <w:rPr>
-          <w:b/>
-          <w:szCs w:val="26"/>
-        </w:rPr>
-        <w:t>Các khả năng kết quả khác</w:t>
-      </w:r>
-      <w:r>
-        <w:rPr>
-          <w:b/>
-          <w:color w:val="000000" w:themeColor="text1"/>
-        </w:rPr>
-        <w:t>:</w:t>
-      </w:r>
-    </w:p>
-    <w:p>
-      <w:pPr>
-        <w:pStyle w:val="ListBullet"/>
-        <w:spacing w:line="360" w:lineRule="auto"/>
-      </w:pPr>
-      <w:r>
-        <w:t>Biện pháp kiểm soát không hiệu quả và rủi ro được nâng cấp để Ban điều hành xử lý.</w:t>
-      </w:r>
-    </w:p>
-    <w:p>
-      <w:pPr>
-        <w:pStyle w:val="ListBullet"/>
-        <w:spacing w:line="360" w:lineRule="auto"/>
-      </w:pPr>
-      <w:r>
-        <w:t>Điểm không phù hợp quá hạn vì thiếu nguồn lực hoặc chưa xác định đúng nguyên nhân gốc.</w:t>
-      </w:r>
-    </w:p>
-    <w:p>
-      <w:pPr>
-        <w:pStyle w:val="ListBullet"/>
-        <w:spacing w:line="360" w:lineRule="auto"/>
-      </w:pPr>
-      <w:r>
-        <w:t>Rủi ro được chấp nhận có điều kiện và tiếp tục giám sát theo thời hạn phê duyệt.</w:t>
+        <w:pStyle w:val="ListBullet"/>
+        <w:numPr>
+          <w:ilvl w:val="0"/>
+          <w:numId w:val="0"/>
+        </w:numPr>
+        <w:spacing w:line="360" w:lineRule="auto"/>
+        <w:ind w:left="539"/>
+        <w:rPr>
+          <w:color w:val="auto"/>
+          <w:sz w:val="24"/>
+          <w:szCs w:val="24"/>
+        </w:rPr>
+      </w:pPr>
+      <w:r>
+        <w:t>Sau khi hoàn thành, quy trình có thể tạo ra các kết quả sau:</w:t>
+      </w:r>
+    </w:p>
+    <w:p>
+      <w:pPr>
+        <w:pStyle w:val="ListBullet"/>
+        <w:spacing w:line="360" w:lineRule="auto"/>
+      </w:pPr>
+      <w:r>
+        <w:t>Danh mục rủi ro và các nghĩa vụ tuân thủ được cập nhật, các kiểm soát trọng yếu được triển khai và các sự cố hoặc điểm không phù hợp được xử lý, xác minh.</w:t>
+      </w:r>
+    </w:p>
+    <w:p>
+      <w:pPr>
+        <w:pStyle w:val="ListBullet"/>
+        <w:spacing w:line="360" w:lineRule="auto"/>
+      </w:pPr>
+      <w:r>
+        <w:t>Trường hợp biện pháp kiểm soát không đạt hiệu quả mong muốn, rủi ro có thể được nâng mức và trình Ban điều hành xem xét phương án xử lý.</w:t>
+      </w:r>
+    </w:p>
+    <w:p>
+      <w:pPr>
+        <w:pStyle w:val="ListBullet"/>
+        <w:spacing w:line="360" w:lineRule="auto"/>
+      </w:pPr>
+      <w:r>
+        <w:t>Việc khắc phục điểm không phù hợp có thể bị chậm khi thiếu nguồn lực hoặc chưa xác định chính xác nguyên nhân gốc.</w:t>
+      </w:r>
+    </w:p>
+    <w:p>
+      <w:pPr>
+        <w:pStyle w:val="ListBullet"/>
+        <w:spacing w:line="360" w:lineRule="auto"/>
+      </w:pPr>
+      <w:r>
+        <w:t>Một số rủi ro có thể được chấp nhận có điều kiện và tiếp tục được giám sát trong thời hạn đã được cấp có thẩm quyền phê duyệt.</w:t>
       </w:r>
     </w:p>
     <w:p>
@@ -3124,7 +2769,7 @@
   <w:abstractNum w:abstractNumId="0" w15:restartNumberingAfterBreak="0">
     <w:nsid w:val="FFFFFF88"/>
     <w:multiLevelType w:val="singleLevel"/>
-    <w:tmpl w:val="3CC83E46"/>
+    <w:tmpl w:val="D1540E88"/>
     <w:lvl w:ilvl="0">
       <w:start w:val="1"/>
       <w:numFmt w:val="decimal"/>
@@ -3137,9 +2782,6 @@
         </w:tabs>
         <w:ind w:left="360" w:hanging="360"/>
       </w:pPr>
-      <w:rPr>
-        <w:rFonts w:hint="default"/>
-      </w:rPr>
     </w:lvl>
   </w:abstractNum>
   <w:abstractNum w:abstractNumId="1" w15:restartNumberingAfterBreak="0">
@@ -3183,6 +2825,15 @@
     <w:lvlOverride w:ilvl="0">
       <w:startOverride w:val="1"/>
     </w:lvlOverride>
+  </w:num>
+  <w:num w:numId="6" w16cid:durableId="1155033039">
+    <w:abstractNumId w:val="0"/>
+  </w:num>
+  <w:num w:numId="7" w16cid:durableId="1132096256">
+    <w:abstractNumId w:val="0"/>
+  </w:num>
+  <w:num w:numId="8" w16cid:durableId="1910531041">
+    <w:abstractNumId w:val="0"/>
   </w:num>
 </w:numbering>
 </file>
@@ -3802,7 +3453,6 @@
   <w:style w:type="character" w:default="1" w:styleId="DefaultParagraphFont">
     <w:name w:val="Default Paragraph Font"/>
     <w:uiPriority w:val="1"/>
-    <w:semiHidden/>
     <w:unhideWhenUsed/>
   </w:style>
   <w:style w:type="table" w:default="1" w:styleId="TableNormal">
@@ -4191,6 +3841,39 @@
       <w:contextualSpacing/>
     </w:pPr>
   </w:style>
+  <w:style w:type="paragraph" w:customStyle="1" w:styleId="isselectedend">
+    <w:name w:val="isselectedend"/>
+    <w:basedOn w:val="Normal"/>
+    <w:rsid w:val="00C726EB"/>
+    <w:pPr>
+      <w:spacing w:before="100" w:beforeAutospacing="1" w:after="100" w:afterAutospacing="1" w:line="240" w:lineRule="auto"/>
+      <w:jc w:val="left"/>
+    </w:pPr>
+    <w:rPr>
+      <w:rFonts w:cs="Times New Roman"/>
+      <w:color w:val="auto"/>
+      <w:sz w:val="24"/>
+      <w:szCs w:val="24"/>
+    </w:rPr>
+  </w:style>
+  <w:style w:type="paragraph" w:styleId="NormalWeb">
+    <w:name w:val="Normal (Web)"/>
+    <w:basedOn w:val="Normal"/>
+    <w:uiPriority w:val="99"/>
+    <w:semiHidden/>
+    <w:unhideWhenUsed/>
+    <w:rsid w:val="00C726EB"/>
+    <w:pPr>
+      <w:spacing w:before="100" w:beforeAutospacing="1" w:after="100" w:afterAutospacing="1" w:line="240" w:lineRule="auto"/>
+      <w:jc w:val="left"/>
+    </w:pPr>
+    <w:rPr>
+      <w:rFonts w:cs="Times New Roman"/>
+      <w:color w:val="auto"/>
+      <w:sz w:val="24"/>
+      <w:szCs w:val="24"/>
+    </w:rPr>
+  </w:style>
 </w:styles>
 </file>
 

</xml_diff>